<commit_message>
Revise Project Documentation docx to be end-to-end and detailed with team details
</commit_message>
<xml_diff>
--- a/7.Project Documentation/Project Documentation.docx
+++ b/7.Project Documentation/Project Documentation.docx
@@ -7,7 +7,7 @@
         <w:pStyle w:val="Heading1"/>
       </w:pPr>
       <w:r>
-        <w:t>Human Development Index Predictor: A Machine Learning Approach</w:t>
+        <w:t>Human Development Index Predictor: An Intelligent Machine Learning Approach to Development Simulation</w:t>
       </w:r>
     </w:p>
     <w:p>
@@ -15,7 +15,517 @@
         <w:pStyle w:val="Heading2"/>
       </w:pPr>
       <w:r>
+        <w:t>Document Metadata</w:t>
+      </w:r>
+    </w:p>
+    <w:p>
+      <w:pPr>
+        <w:pStyle w:val="ListBullet"/>
+      </w:pPr>
+      <w:r/>
+      <w:r>
+        <w:rPr>
+          <w:b/>
+        </w:rPr>
+        <w:t>Project Title</w:t>
+      </w:r>
+      <w:r>
+        <w:t>: Human Development Index (HDI) Predictor &amp; Policy Simulation System</w:t>
+      </w:r>
+    </w:p>
+    <w:p>
+      <w:pPr>
+        <w:pStyle w:val="ListBullet"/>
+      </w:pPr>
+      <w:r/>
+      <w:r>
+        <w:rPr>
+          <w:b/>
+        </w:rPr>
+        <w:t>Authors &amp; Team Members</w:t>
+      </w:r>
+      <w:r>
+        <w:t>:</w:t>
+      </w:r>
+    </w:p>
+    <w:p>
+      <w:pPr>
+        <w:pStyle w:val="ListNumber"/>
+      </w:pPr>
+      <w:r/>
+      <w:r>
+        <w:rPr>
+          <w:b/>
+        </w:rPr>
+        <w:t>Keerthi Jaswanth Yadav</w:t>
+      </w:r>
+      <w:r>
+        <w:t xml:space="preserve"> (Project Lead &amp; System Integration Developer)</w:t>
+      </w:r>
+    </w:p>
+    <w:p>
+      <w:pPr>
+        <w:pStyle w:val="ListNumber"/>
+      </w:pPr>
+      <w:r/>
+      <w:r>
+        <w:rPr>
+          <w:b/>
+        </w:rPr>
+        <w:t>Beldhari Swapna</w:t>
+      </w:r>
+      <w:r>
+        <w:t xml:space="preserve"> (Lead Data Scientist &amp; ML Engineer)</w:t>
+      </w:r>
+    </w:p>
+    <w:p>
+      <w:pPr>
+        <w:pStyle w:val="ListNumber"/>
+      </w:pPr>
+      <w:r/>
+      <w:r>
+        <w:rPr>
+          <w:b/>
+        </w:rPr>
+        <w:t>Bandi Sai Kiran</w:t>
+      </w:r>
+      <w:r>
+        <w:t xml:space="preserve"> (Frontend Engineer &amp; UI Designer)</w:t>
+      </w:r>
+    </w:p>
+    <w:p>
+      <w:pPr>
+        <w:pStyle w:val="ListBullet"/>
+      </w:pPr>
+      <w:r/>
+      <w:r>
+        <w:rPr>
+          <w:b/>
+        </w:rPr>
+        <w:t>Institution / Program</w:t>
+      </w:r>
+      <w:r>
+        <w:t>: Machine Learning &amp; AI Capstone Project</w:t>
+      </w:r>
+    </w:p>
+    <w:p>
+      <w:pPr>
+        <w:pStyle w:val="ListBullet"/>
+      </w:pPr>
+      <w:r/>
+      <w:r>
+        <w:rPr>
+          <w:b/>
+        </w:rPr>
+        <w:t>Status</w:t>
+      </w:r>
+      <w:r>
+        <w:t>: Completed &amp; Serialized</w:t>
+      </w:r>
+    </w:p>
+    <w:p>
+      <w:pPr>
+        <w:pStyle w:val="ListBullet"/>
+      </w:pPr>
+      <w:r/>
+      <w:r>
+        <w:rPr>
+          <w:b/>
+        </w:rPr>
+        <w:t>Repository URL</w:t>
+      </w:r>
+      <w:r>
+        <w:t>: [https://github.com/Jaswanth258/HDI](https://github.com/Jaswanth258/HDI)</w:t>
+      </w:r>
+    </w:p>
+    <w:p>
+      <w:pPr>
+        <w:pStyle w:val="ListBullet"/>
+      </w:pPr>
+      <w:r/>
+      <w:r>
+        <w:rPr>
+          <w:b/>
+        </w:rPr>
+        <w:t>Video Demonstration</w:t>
+      </w:r>
+      <w:r>
+        <w:t>: [Google Drive Demo Link](https://drive.google.com/file/d/1SGMQ0ISFxUGTr5hJNGJdoDYp_xgMIbGE/view?usp=drivesdk)</w:t>
+      </w:r>
+    </w:p>
+    <w:p>
+      <w:r>
+        <w:t>---</w:t>
+      </w:r>
+    </w:p>
+    <w:p>
+      <w:pPr>
+        <w:pStyle w:val="Heading2"/>
+      </w:pPr>
+      <w:r>
+        <w:t>Table of Contents</w:t>
+      </w:r>
+    </w:p>
+    <w:p>
+      <w:pPr>
+        <w:pStyle w:val="ListNumber"/>
+      </w:pPr>
+      <w:r/>
+      <w:r>
+        <w:rPr>
+          <w:b/>
+        </w:rPr>
         <w:t>Abstract</w:t>
+      </w:r>
+      <w:r/>
+    </w:p>
+    <w:p>
+      <w:pPr>
+        <w:pStyle w:val="ListNumber"/>
+      </w:pPr>
+      <w:r/>
+      <w:r>
+        <w:rPr>
+          <w:b/>
+        </w:rPr>
+        <w:t>Phase 1: Brainstorming &amp; Ideation</w:t>
+      </w:r>
+      <w:r/>
+    </w:p>
+    <w:p>
+      <w:pPr>
+        <w:pStyle w:val="ListBullet"/>
+      </w:pPr>
+      <w:r>
+        <w:t>2.1 Problem Statements</w:t>
+      </w:r>
+    </w:p>
+    <w:p>
+      <w:pPr>
+        <w:pStyle w:val="ListBullet"/>
+      </w:pPr>
+      <w:r>
+        <w:t>2.2 Empathy Mapping</w:t>
+      </w:r>
+    </w:p>
+    <w:p>
+      <w:pPr>
+        <w:pStyle w:val="ListBullet"/>
+      </w:pPr>
+      <w:r>
+        <w:t>2.3 Idea Prioritization &amp; Selection</w:t>
+      </w:r>
+    </w:p>
+    <w:p>
+      <w:pPr>
+        <w:pStyle w:val="ListNumber"/>
+      </w:pPr>
+      <w:r/>
+      <w:r>
+        <w:rPr>
+          <w:b/>
+        </w:rPr>
+        <w:t>Phase 2: Requirement Analysis</w:t>
+      </w:r>
+      <w:r/>
+    </w:p>
+    <w:p>
+      <w:pPr>
+        <w:pStyle w:val="ListBullet"/>
+      </w:pPr>
+      <w:r>
+        <w:t>3.1 Customer Journey Mapping</w:t>
+      </w:r>
+    </w:p>
+    <w:p>
+      <w:pPr>
+        <w:pStyle w:val="ListBullet"/>
+      </w:pPr>
+      <w:r>
+        <w:t>3.2 Data Flow Diagram (DFD Level 0 and 1)</w:t>
+      </w:r>
+    </w:p>
+    <w:p>
+      <w:pPr>
+        <w:pStyle w:val="ListBullet"/>
+      </w:pPr>
+      <w:r>
+        <w:t>3.3 Solution Requirements (Functional &amp; Non-Functional)</w:t>
+      </w:r>
+    </w:p>
+    <w:p>
+      <w:pPr>
+        <w:pStyle w:val="ListBullet"/>
+      </w:pPr>
+      <w:r>
+        <w:t>3.4 Technology Stack Configuration</w:t>
+      </w:r>
+    </w:p>
+    <w:p>
+      <w:pPr>
+        <w:pStyle w:val="ListNumber"/>
+      </w:pPr>
+      <w:r/>
+      <w:r>
+        <w:rPr>
+          <w:b/>
+        </w:rPr>
+        <w:t>Phase 3 &amp; 4: Project Design and Planning</w:t>
+      </w:r>
+      <w:r/>
+    </w:p>
+    <w:p>
+      <w:pPr>
+        <w:pStyle w:val="ListBullet"/>
+      </w:pPr>
+      <w:r>
+        <w:t>4.1 System Architecture</w:t>
+      </w:r>
+    </w:p>
+    <w:p>
+      <w:pPr>
+        <w:pStyle w:val="ListBullet"/>
+      </w:pPr>
+      <w:r>
+        <w:t>4.2 Problem-Solution Fit</w:t>
+      </w:r>
+    </w:p>
+    <w:p>
+      <w:pPr>
+        <w:pStyle w:val="ListBullet"/>
+      </w:pPr>
+      <w:r>
+        <w:t>4.3 Project Schedule &amp; Sprint Breakdown</w:t>
+      </w:r>
+    </w:p>
+    <w:p>
+      <w:pPr>
+        <w:pStyle w:val="ListBullet"/>
+      </w:pPr>
+      <w:r>
+        <w:t>4.4 Risk Assessment &amp; Mitigation</w:t>
+      </w:r>
+    </w:p>
+    <w:p>
+      <w:pPr>
+        <w:pStyle w:val="ListNumber"/>
+      </w:pPr>
+      <w:r/>
+      <w:r>
+        <w:rPr>
+          <w:b/>
+        </w:rPr>
+        <w:t>Phase 5: Project Development</w:t>
+      </w:r>
+      <w:r/>
+    </w:p>
+    <w:p>
+      <w:pPr>
+        <w:pStyle w:val="ListBullet"/>
+      </w:pPr>
+      <w:r>
+        <w:t>5.1 Preprocessing and Feature Engineering</w:t>
+      </w:r>
+    </w:p>
+    <w:p>
+      <w:pPr>
+        <w:pStyle w:val="ListBullet"/>
+      </w:pPr>
+      <w:r>
+        <w:t>5.2 Exploratory Data Analysis (EDA) and Visualizations</w:t>
+      </w:r>
+    </w:p>
+    <w:p>
+      <w:pPr>
+        <w:pStyle w:val="ListBullet"/>
+      </w:pPr>
+      <w:r>
+        <w:t>5.3 Machine Learning Model Building &amp; Training</w:t>
+      </w:r>
+    </w:p>
+    <w:p>
+      <w:pPr>
+        <w:pStyle w:val="ListBullet"/>
+      </w:pPr>
+      <w:r>
+        <w:t>5.4 Serialization (Pickle Module Integration)</w:t>
+      </w:r>
+    </w:p>
+    <w:p>
+      <w:pPr>
+        <w:pStyle w:val="ListBullet"/>
+      </w:pPr>
+      <w:r>
+        <w:t>5.5 Backend Routing (Flask Web Architecture)</w:t>
+      </w:r>
+    </w:p>
+    <w:p>
+      <w:pPr>
+        <w:pStyle w:val="ListBullet"/>
+      </w:pPr>
+      <w:r>
+        <w:t>5.6 Frontend Layout Design (Glassmorphic Dark Theme)</w:t>
+      </w:r>
+    </w:p>
+    <w:p>
+      <w:pPr>
+        <w:pStyle w:val="ListNumber"/>
+      </w:pPr>
+      <w:r/>
+      <w:r>
+        <w:rPr>
+          <w:b/>
+        </w:rPr>
+        <w:t>Phase 6: Project Testing &amp; Quality Assurance</w:t>
+      </w:r>
+      <w:r/>
+    </w:p>
+    <w:p>
+      <w:pPr>
+        <w:pStyle w:val="ListBullet"/>
+      </w:pPr>
+      <w:r>
+        <w:t>6.1 Functional Test Matrix</w:t>
+      </w:r>
+    </w:p>
+    <w:p>
+      <w:pPr>
+        <w:pStyle w:val="ListBullet"/>
+      </w:pPr>
+      <w:r>
+        <w:t>6.2 Input Validation &amp; Boundary Testing</w:t>
+      </w:r>
+    </w:p>
+    <w:p>
+      <w:pPr>
+        <w:pStyle w:val="ListBullet"/>
+      </w:pPr>
+      <w:r>
+        <w:t>6.3 Performance and Latency Metrics</w:t>
+      </w:r>
+    </w:p>
+    <w:p>
+      <w:pPr>
+        <w:pStyle w:val="ListBullet"/>
+      </w:pPr>
+      <w:r>
+        <w:t>6.4 User Acceptance Testing (UAT) Scenarios</w:t>
+      </w:r>
+    </w:p>
+    <w:p>
+      <w:pPr>
+        <w:pStyle w:val="ListBullet"/>
+      </w:pPr>
+      <w:r>
+        <w:t>6.5 Issues Identified &amp; Resolved</w:t>
+      </w:r>
+    </w:p>
+    <w:p>
+      <w:pPr>
+        <w:pStyle w:val="ListNumber"/>
+      </w:pPr>
+      <w:r/>
+      <w:r>
+        <w:rPr>
+          <w:b/>
+        </w:rPr>
+        <w:t>Phase 7 &amp; 8: Project Demonstration, Scalability &amp; Roadmap</w:t>
+      </w:r>
+      <w:r/>
+    </w:p>
+    <w:p>
+      <w:pPr>
+        <w:pStyle w:val="ListBullet"/>
+      </w:pPr>
+      <w:r>
+        <w:t>7.1 Demonstration flow and Scenarios</w:t>
+      </w:r>
+    </w:p>
+    <w:p>
+      <w:pPr>
+        <w:pStyle w:val="ListBullet"/>
+      </w:pPr>
+      <w:r>
+        <w:t>7.2 UI Scripted Screen Walkthrough</w:t>
+      </w:r>
+    </w:p>
+    <w:p>
+      <w:pPr>
+        <w:pStyle w:val="ListBullet"/>
+      </w:pPr>
+      <w:r>
+        <w:t>7.3 Scalability &amp; Future Roadmap</w:t>
+      </w:r>
+    </w:p>
+    <w:p>
+      <w:pPr>
+        <w:pStyle w:val="ListNumber"/>
+      </w:pPr>
+      <w:r/>
+      <w:r>
+        <w:rPr>
+          <w:b/>
+        </w:rPr>
+        <w:t>Conclusion &amp; Future Enhancements</w:t>
+      </w:r>
+      <w:r/>
+    </w:p>
+    <w:p>
+      <w:pPr>
+        <w:pStyle w:val="ListNumber"/>
+      </w:pPr>
+      <w:r/>
+      <w:r>
+        <w:rPr>
+          <w:b/>
+        </w:rPr>
+        <w:t>Appendix</w:t>
+      </w:r>
+      <w:r/>
+    </w:p>
+    <w:p>
+      <w:pPr>
+        <w:pStyle w:val="ListBullet"/>
+      </w:pPr>
+      <w:r>
+        <w:t>Appendix A: Software Requirements</w:t>
+      </w:r>
+    </w:p>
+    <w:p>
+      <w:pPr>
+        <w:pStyle w:val="ListBullet"/>
+      </w:pPr>
+      <w:r>
+        <w:t>Appendix B: Hardware Requirements</w:t>
+      </w:r>
+    </w:p>
+    <w:p>
+      <w:pPr>
+        <w:pStyle w:val="ListBullet"/>
+      </w:pPr>
+      <w:r>
+        <w:t>Appendix C: Project Directory Structure</w:t>
+      </w:r>
+    </w:p>
+    <w:p>
+      <w:pPr>
+        <w:pStyle w:val="ListBullet"/>
+      </w:pPr>
+      <w:r>
+        <w:t>Appendix D: References</w:t>
+      </w:r>
+    </w:p>
+    <w:p>
+      <w:r>
+        <w:t>---</w:t>
+      </w:r>
+    </w:p>
+    <w:p>
+      <w:pPr>
+        <w:pStyle w:val="Heading2"/>
+      </w:pPr>
+      <w:r>
+        <w:t>1. Abstract</w:t>
       </w:r>
     </w:p>
     <w:p>
@@ -70,86 +580,95 @@
         <w:pStyle w:val="Heading2"/>
       </w:pPr>
       <w:r>
-        <w:t>Project Description</w:t>
+        <w:t>2. Phase 1: Brainstorming &amp; Ideation</w:t>
       </w:r>
     </w:p>
     <w:p>
-      <w:r>
-        <w:t>Human development assessment is crucial for allocating global aid, directing infrastructure investments, and formulating educational and healthcare reforms. Despite the availability of demographic data, calculating and visualizing composite index shifts remains complex and non-interactive for policy designers.</w:t>
+      <w:pPr>
+        <w:pStyle w:val="Heading3"/>
+      </w:pPr>
+      <w:r>
+        <w:t>2.1 Problem Statements</w:t>
       </w:r>
     </w:p>
     <w:p>
       <w:r>
-        <w:t xml:space="preserve">The </w:t>
-      </w:r>
+        <w:t>The team identified five core problems that currently limit HDI analysis:</w:t>
+      </w:r>
+    </w:p>
+    <w:p>
+      <w:pPr>
+        <w:pStyle w:val="ListNumber"/>
+      </w:pPr>
+      <w:r/>
       <w:r>
         <w:rPr>
           <w:b/>
         </w:rPr>
-        <w:t>Human Development Index Predictor</w:t>
-      </w:r>
-      <w:r>
-        <w:t xml:space="preserve"> addresses this challenge by building an end-to-end predictive software solution. The system is trained on historical demographic indicators. The preprocessed data is fitted to a Linear Regression model, which serves as the continuous predictor. The web application features custom forms with input range validations, progress meters, and dynamic insights that adjust recommendations according to the predicted tier:</w:t>
+        <w:t>Delayed and Retrospective Official Data Reporting</w:t>
+      </w:r>
+      <w:r>
+        <w:t>: UNDP publishes index reports annually, reflecting historical cycles rather than immediate, real-time indicator shifts.</w:t>
       </w:r>
     </w:p>
     <w:p>
       <w:pPr>
-        <w:pStyle w:val="ListBullet"/>
+        <w:pStyle w:val="ListNumber"/>
       </w:pPr>
       <w:r/>
       <w:r>
         <w:rPr>
           <w:b/>
         </w:rPr>
-        <w:t>Very High Human Development</w:t>
-      </w:r>
-      <w:r>
-        <w:t xml:space="preserve"> (Score $\ge 0.800$)</w:t>
+        <w:t>Complexity in Calculating Multi-Dimensional Composite Indices</w:t>
+      </w:r>
+      <w:r>
+        <w:t>: Calculating geometric means of normalized indexes is complex and non-interactive for policy designers.</w:t>
       </w:r>
     </w:p>
     <w:p>
       <w:pPr>
-        <w:pStyle w:val="ListBullet"/>
+        <w:pStyle w:val="ListNumber"/>
       </w:pPr>
       <w:r/>
       <w:r>
         <w:rPr>
           <w:b/>
         </w:rPr>
-        <w:t>High Human Development</w:t>
-      </w:r>
-      <w:r>
-        <w:t xml:space="preserve"> (Score $0.700$ to $0.799$)</w:t>
+        <w:t>Inability to Run "What-If" Planning Simulations</w:t>
+      </w:r>
+      <w:r>
+        <w:t>: Planners lack sandbox tools to simulate how changes in specific sectors (e.g. adding 2 years of schooling) affect overall scores.</w:t>
       </w:r>
     </w:p>
     <w:p>
       <w:pPr>
-        <w:pStyle w:val="ListBullet"/>
+        <w:pStyle w:val="ListNumber"/>
       </w:pPr>
       <w:r/>
       <w:r>
         <w:rPr>
           <w:b/>
         </w:rPr>
-        <w:t>Medium Human Development</w:t>
-      </w:r>
-      <w:r>
-        <w:t xml:space="preserve"> (Score $0.550$ to $0.699$)</w:t>
+        <w:t>Lack of Actionable Recommendations from Raw Indices</w:t>
+      </w:r>
+      <w:r>
+        <w:t>: Existing publications provide rankings but lack automatic policy guidance mapped to development levels.</w:t>
       </w:r>
     </w:p>
     <w:p>
       <w:pPr>
-        <w:pStyle w:val="ListBullet"/>
+        <w:pStyle w:val="ListNumber"/>
       </w:pPr>
       <w:r/>
       <w:r>
         <w:rPr>
           <w:b/>
         </w:rPr>
-        <w:t>Low Human Development</w:t>
-      </w:r>
-      <w:r>
-        <w:t xml:space="preserve"> (Score $&lt; 0.550$)</w:t>
+        <w:t>Poor Accessibility and Technical Presentation of Data</w:t>
+      </w:r>
+      <w:r>
+        <w:t>: Raw CSV and PDF tables are difficult to interpret for non-technical stakeholders and public users.</w:t>
       </w:r>
     </w:p>
     <w:p>
@@ -157,56 +676,283 @@
         <w:pStyle w:val="Heading3"/>
       </w:pPr>
       <w:r>
-        <w:t>Scenario 1: Policy Reform Simulation (Very High Development)</w:t>
+        <w:t>2.2 Empathy Mapping</w:t>
       </w:r>
     </w:p>
     <w:p>
       <w:r>
-        <w:t>A government analyst plans an expansion of higher education and healthcare systems in a region. By inputting the target indicators (e.g. Life Expectancy = 82, GNI = $55,000, expected schooling = 16 years, mean schooling = 13 years) into the application, the model predicts an HDI of 1.0 (clamped maximum) in the "Very High" tier. The system generates targeted policy feedback suggesting investments in technology sectors and reducing structural inequalities.</w:t>
+        <w:t>To address these issues, the team mapped target personas (policy analysts, academic researchers, economics students):</w:t>
       </w:r>
     </w:p>
     <w:p>
       <w:pPr>
-        <w:pStyle w:val="Heading3"/>
-      </w:pPr>
-      <w:r>
-        <w:t>Scenario 2: Developing-Tier Assessment (Medium Development)</w:t>
-      </w:r>
+        <w:pStyle w:val="ListBullet"/>
+      </w:pPr>
+      <w:r/>
+      <w:r>
+        <w:rPr>
+          <w:b/>
+        </w:rPr>
+        <w:t>Says</w:t>
+      </w:r>
+      <w:r>
+        <w:t xml:space="preserve">: </w:t>
+      </w:r>
+      <w:r>
+        <w:rPr>
+          <w:i/>
+        </w:rPr>
+        <w:t>"I need a quick simulation tool to test how budget allocations impact country scores."</w:t>
+      </w:r>
+      <w:r/>
     </w:p>
     <w:p>
-      <w:r>
-        <w:t>During review, development analysts examine a profile with lower indicators (e.g. Life Expectancy = 62, GNI = $8,000, expected schooling = 10 years, mean schooling = 6 years). The model predicts a score in the Medium range (~0.64), assigning an orange badge. The recommendation module prompts the user to focus on primary and secondary school enrollment, expansion of preventive healthcare, and economic diversification.</w:t>
-      </w:r>
+      <w:pPr>
+        <w:pStyle w:val="ListBullet"/>
+      </w:pPr>
+      <w:r/>
+      <w:r>
+        <w:rPr>
+          <w:b/>
+        </w:rPr>
+        <w:t>Thinks</w:t>
+      </w:r>
+      <w:r>
+        <w:t xml:space="preserve">: </w:t>
+      </w:r>
+      <w:r>
+        <w:rPr>
+          <w:i/>
+        </w:rPr>
+        <w:t>"Calculating multi-dimensional indexes manually is tedious and slow."</w:t>
+      </w:r>
+      <w:r/>
     </w:p>
     <w:p>
       <w:pPr>
-        <w:pStyle w:val="Heading3"/>
-      </w:pPr>
-      <w:r>
-        <w:t>Scenario 3: Model Performance Validation</w:t>
-      </w:r>
+        <w:pStyle w:val="ListBullet"/>
+      </w:pPr>
+      <w:r/>
+      <w:r>
+        <w:rPr>
+          <w:b/>
+        </w:rPr>
+        <w:t>Does</w:t>
+      </w:r>
+      <w:r>
+        <w:t xml:space="preserve">: </w:t>
+      </w:r>
+      <w:r>
+        <w:rPr>
+          <w:i/>
+        </w:rPr>
+        <w:t>"Collects census data, runs scripting files, drafts policy briefs, and plots charts."</w:t>
+      </w:r>
+      <w:r/>
     </w:p>
     <w:p>
-      <w:r>
-        <w:t>An ML engineer evaluates the accuracy of the regression model. Comparing predictions against a test split, the engineer confirms a high correlation between schooling metrics and the final HDI score. The serialized artifacts (`hdi_model.pkl` and `encoder.pkl`) are verified to load with low latency (&lt;200ms) on server startup.</w:t>
-      </w:r>
+      <w:pPr>
+        <w:pStyle w:val="ListBullet"/>
+      </w:pPr>
+      <w:r/>
+      <w:r>
+        <w:rPr>
+          <w:b/>
+        </w:rPr>
+        <w:t>Feels</w:t>
+      </w:r>
+      <w:r>
+        <w:t xml:space="preserve">: </w:t>
+      </w:r>
+      <w:r>
+        <w:rPr>
+          <w:i/>
+        </w:rPr>
+        <w:t>"Frustrated by data reporting delays and the lack of interactive analysis tools."</w:t>
+      </w:r>
+      <w:r/>
     </w:p>
     <w:p>
-      <w:r>
-        <w:t>---</w:t>
+      <w:pPr>
+        <w:pStyle w:val="Heading3"/>
+      </w:pPr>
+      <w:r>
+        <w:t>2.3 Idea Prioritization &amp; Selection</w:t>
       </w:r>
     </w:p>
     <w:p>
-      <w:pPr>
-        <w:pStyle w:val="Heading2"/>
-      </w:pPr>
-      <w:r>
-        <w:t>Technical Architecture</w:t>
+      <w:r>
+        <w:t>Using a Value vs. Complexity matrix, the team evaluated several approaches:</w:t>
       </w:r>
     </w:p>
     <w:p>
-      <w:r>
-        <w:t>The system utilizes a multi-layer software architecture to segregate presentation, routing logic, model execution, and file storage:</w:t>
+      <w:pPr>
+        <w:pStyle w:val="ListBullet"/>
+      </w:pPr>
+      <w:r/>
+      <w:r>
+        <w:rPr>
+          <w:i/>
+        </w:rPr>
+        <w:t>Idea A: Time-series forecasting API (High value / High complexity)</w:t>
+      </w:r>
+      <w:r>
+        <w:t>.</w:t>
+      </w:r>
+    </w:p>
+    <w:p>
+      <w:pPr>
+        <w:pStyle w:val="ListBullet"/>
+      </w:pPr>
+      <w:r/>
+      <w:r>
+        <w:rPr>
+          <w:i/>
+        </w:rPr>
+        <w:t>Idea B: Static dashboard reports (Low value / Low complexity)</w:t>
+      </w:r>
+      <w:r>
+        <w:t>.</w:t>
+      </w:r>
+    </w:p>
+    <w:p>
+      <w:pPr>
+        <w:pStyle w:val="ListBullet"/>
+      </w:pPr>
+      <w:r/>
+      <w:r>
+        <w:rPr>
+          <w:i/>
+        </w:rPr>
+        <w:t>Idea C: Interactive ML-based predictive system (High value / Medium complexity)</w:t>
+      </w:r>
+      <w:r>
+        <w:t>.</w:t>
+      </w:r>
+    </w:p>
+    <w:p>
+      <w:r/>
+      <w:r>
+        <w:rPr>
+          <w:b/>
+        </w:rPr>
+        <w:t>Decision</w:t>
+      </w:r>
+      <w:r>
+        <w:t>: Idea C was selected. By deploying a regression model inside a Flask server, the system provides real-time predictions and policy suggestions through an accessible web interface.</w:t>
+      </w:r>
+    </w:p>
+    <w:p>
+      <w:r>
+        <w:t>---</w:t>
+      </w:r>
+    </w:p>
+    <w:p>
+      <w:pPr>
+        <w:pStyle w:val="Heading2"/>
+      </w:pPr>
+      <w:r>
+        <w:t>3. Phase 2: Requirement Analysis</w:t>
+      </w:r>
+    </w:p>
+    <w:p>
+      <w:pPr>
+        <w:pStyle w:val="Heading3"/>
+      </w:pPr>
+      <w:r>
+        <w:t>3.1 Customer Journey Mapping</w:t>
+      </w:r>
+    </w:p>
+    <w:p>
+      <w:pPr>
+        <w:pStyle w:val="ListBullet"/>
+      </w:pPr>
+      <w:r/>
+      <w:r>
+        <w:rPr>
+          <w:b/>
+        </w:rPr>
+        <w:t>Discovery</w:t>
+      </w:r>
+      <w:r>
+        <w:t>: User opens the website to research human development statistics.</w:t>
+      </w:r>
+    </w:p>
+    <w:p>
+      <w:pPr>
+        <w:pStyle w:val="ListBullet"/>
+      </w:pPr>
+      <w:r/>
+      <w:r>
+        <w:rPr>
+          <w:b/>
+        </w:rPr>
+        <w:t>Interaction</w:t>
+      </w:r>
+      <w:r>
+        <w:t>: User inputs specific indicators for a hypothetical or actual country.</w:t>
+      </w:r>
+    </w:p>
+    <w:p>
+      <w:pPr>
+        <w:pStyle w:val="ListBullet"/>
+      </w:pPr>
+      <w:r/>
+      <w:r>
+        <w:rPr>
+          <w:b/>
+        </w:rPr>
+        <w:t>Action</w:t>
+      </w:r>
+      <w:r>
+        <w:t>: User clicks predict; backend runs the parameters through the trained model.</w:t>
+      </w:r>
+    </w:p>
+    <w:p>
+      <w:pPr>
+        <w:pStyle w:val="ListBullet"/>
+      </w:pPr>
+      <w:r/>
+      <w:r>
+        <w:rPr>
+          <w:b/>
+        </w:rPr>
+        <w:t>Outcome</w:t>
+      </w:r>
+      <w:r>
+        <w:t>: User views the predicted score, tier badge, progress gauge, and policy recommendations.</w:t>
+      </w:r>
+    </w:p>
+    <w:p>
+      <w:pPr>
+        <w:pStyle w:val="ListBullet"/>
+      </w:pPr>
+      <w:r/>
+      <w:r>
+        <w:rPr>
+          <w:b/>
+        </w:rPr>
+        <w:t>Follow-up</w:t>
+      </w:r>
+      <w:r>
+        <w:t>: User edits inputs to run comparative scenarios.</w:t>
+      </w:r>
+    </w:p>
+    <w:p>
+      <w:pPr>
+        <w:pStyle w:val="Heading3"/>
+      </w:pPr>
+      <w:r>
+        <w:t>3.2 Data Flow Diagram (DFD)</w:t>
+      </w:r>
+    </w:p>
+    <w:p>
+      <w:r>
+        <w:rPr>
+          <w:b/>
+          <w:sz w:val="22"/>
+        </w:rPr>
+        <w:t>Level 0 DFD (Context Diagram)</w:t>
       </w:r>
     </w:p>
     <w:p>
@@ -221,133 +967,24 @@
           <w:color w:val="0F172A"/>
           <w:sz w:val="19"/>
         </w:rPr>
-        <w:t>┌─────────────────────────────────────────────────────────────────┐</w:t>
+        <w:t>┌──────────────┐          Form Parameters         ┌──────────────┐</w:t>
         <w:br/>
-        <w:t>│                       PRESENTATION LAYER                        │</w:t>
+        <w:t>│              ├─────────────────────────────────►│              │</w:t>
         <w:br/>
-        <w:t>│   - HTML5, CSS3, JavaScript templates                           │</w:t>
+        <w:t>│ User Browser │                                  │ HDI System   │</w:t>
         <w:br/>
-        <w:t>│   - Dark gradient design system, dynamic progress gauges        │</w:t>
+        <w:t>│              │◄─────────────────────────────────┤              │</w:t>
         <w:br/>
-        <w:t>└────────────────────────────────┬────────────────────────────────┘</w:t>
-        <w:br/>
-        <w:t xml:space="preserve">                                 │ HTTP POST Parameters</w:t>
-        <w:br/>
-        <w:t>┌────────────────────────────────▼────────────────────────────────┐</w:t>
-        <w:br/>
-        <w:t>│                     API ROUTING / FLASK LAYER                   │</w:t>
-        <w:br/>
-        <w:t>│   - app.py server routes (/, /predict, /model-info)             │</w:t>
-        <w:br/>
-        <w:t>│   - Server-side input sanitization and type casting             │</w:t>
-        <w:br/>
-        <w:t>└────────────────────────────────┬────────────────────────────────┘</w:t>
-        <w:br/>
-        <w:t xml:space="preserve">                                 │ Cleaned feature array</w:t>
-        <w:br/>
-        <w:t>┌────────────────────────────────▼────────────────────────────────┐</w:t>
-        <w:br/>
-        <w:t>│                       CORE LOGIC SERVICE                        │</w:t>
-        <w:br/>
-        <w:t>│   - sklearn Linear Regression inference                         │</w:t>
-        <w:br/>
-        <w:t>│   - LabelEncoder mapping (models/encoder.pkl)                   │</w:t>
-        <w:br/>
-        <w:t>│   - classify_hdi() and get_hdi_insights() logic engines         │</w:t>
-        <w:br/>
-        <w:t>└────────────────────────────────┬────────────────────────────────┘</w:t>
-        <w:br/>
-        <w:t xml:space="preserve">                                 │ Load serialized files</w:t>
-        <w:br/>
-        <w:t>┌────────────────────────────────▼────────────────────────────────┐</w:t>
-        <w:br/>
-        <w:t>│                      DATA STORAGE / FILESYSTEM                  │</w:t>
-        <w:br/>
-        <w:t>│   - models/hdi_model.pkl (Pickled regression model)             │</w:t>
-        <w:br/>
-        <w:t>│   - models/encoder.pkl (Pickled LabelEncoder)                   │</w:t>
-        <w:br/>
-        <w:t>│   - data/hdi_data.csv (Historical training dataset)             │</w:t>
-        <w:br/>
-        <w:t>└─────────────────────────────────────────────────────────────────┘</w:t>
+        <w:t>└──────────────┘           HTML Results           └──────────────┘</w:t>
       </w:r>
     </w:p>
     <w:p>
-      <w:pPr>
-        <w:pStyle w:val="ListNumber"/>
-      </w:pPr>
-      <w:r/>
       <w:r>
         <w:rPr>
           <w:b/>
+          <w:sz w:val="22"/>
         </w:rPr>
-        <w:t>Presentation Layer (Frontend)</w:t>
-      </w:r>
-      <w:r>
-        <w:t>: Developed using HTML5, CSS3, and JavaScript. Provides a user-friendly interface for inputting demographic indicators and visualizing outputs, including color-coded badges, progress meters, and text recommendations.</w:t>
-      </w:r>
-    </w:p>
-    <w:p>
-      <w:pPr>
-        <w:pStyle w:val="ListNumber"/>
-      </w:pPr>
-      <w:r/>
-      <w:r>
-        <w:rPr>
-          <w:b/>
-        </w:rPr>
-        <w:t>API Gateway / Flask Backend</w:t>
-      </w:r>
-      <w:r>
-        <w:t>: The Flask web server routes request flows, validates form fields, coordinates request variables, passes parameters to the core model, and returns rendered templates.</w:t>
-      </w:r>
-    </w:p>
-    <w:p>
-      <w:pPr>
-        <w:pStyle w:val="ListNumber"/>
-      </w:pPr>
-      <w:r/>
-      <w:r>
-        <w:rPr>
-          <w:b/>
-        </w:rPr>
-        <w:t>Core Logic Layer</w:t>
-      </w:r>
-      <w:r>
-        <w:t>: Preprocesses inputs by transforming categorical labels and executing predictions using the Scikit-learn Linear Regression model. It classifies scores into UNDP categories and retrieves tailored insights.</w:t>
-      </w:r>
-    </w:p>
-    <w:p>
-      <w:pPr>
-        <w:pStyle w:val="ListNumber"/>
-      </w:pPr>
-      <w:r/>
-      <w:r>
-        <w:rPr>
-          <w:b/>
-        </w:rPr>
-        <w:t>Data &amp; Storage Layer</w:t>
-      </w:r>
-      <w:r>
-        <w:t>: Stores the raw training dataset and serialized models in pickle format, allowing for quick deployment without retraining the model on every startup.</w:t>
-      </w:r>
-    </w:p>
-    <w:p>
-      <w:r>
-        <w:t>---</w:t>
-      </w:r>
-    </w:p>
-    <w:p>
-      <w:pPr>
-        <w:pStyle w:val="Heading2"/>
-      </w:pPr>
-      <w:r>
-        <w:t>Project Workflow</w:t>
-      </w:r>
-    </w:p>
-    <w:p>
-      <w:r>
-        <w:t>The application processes user requests in seven sequential steps:</w:t>
+        <w:t>Level 1 DFD (Detailed Process Diagram)</w:t>
       </w:r>
     </w:p>
     <w:p>
@@ -362,895 +999,840 @@
           <w:color w:val="0F172A"/>
           <w:sz w:val="19"/>
         </w:rPr>
-        <w:t>[User Input] ➔ [Validation] ➔ [Preprocessing] ➔ [Model Predict] ➔ [Tier Assign] ➔ [Insight Match] ➔ [UI Render]</w:t>
+        <w:t xml:space="preserve">                  ┌───────────────────────┐</w:t>
+        <w:br/>
+        <w:t xml:space="preserve">                  │ 1. Input Sanitization │</w:t>
+        <w:br/>
+        <w:t xml:space="preserve">                  └──────────┬────────────┘</w:t>
+        <w:br/>
+        <w:t xml:space="preserve">                             │ Cleaned parameters</w:t>
+        <w:br/>
+        <w:t xml:space="preserve">                             ▼</w:t>
+        <w:br/>
+        <w:t xml:space="preserve">                  ┌───────────────────────┐</w:t>
+        <w:br/>
+        <w:t xml:space="preserve">                  │ 2. Parameter Encoding │◄─── [encoder.pkl]</w:t>
+        <w:br/>
+        <w:t xml:space="preserve">                  └──────────┬────────────┘</w:t>
+        <w:br/>
+        <w:t xml:space="preserve">                             │ Feature array</w:t>
+        <w:br/>
+        <w:t xml:space="preserve">                             ▼</w:t>
+        <w:br/>
+        <w:t xml:space="preserve">                  ┌───────────────────────┐</w:t>
+        <w:br/>
+        <w:t xml:space="preserve">                  │ 3. Model Prediction   │◄─── [hdi_model.pkl]</w:t>
+        <w:br/>
+        <w:t xml:space="preserve">                  └──────────┬────────────┘</w:t>
+        <w:br/>
+        <w:t xml:space="preserve">                             │ Raw score [0, 1]</w:t>
+        <w:br/>
+        <w:t xml:space="preserve">                             ▼</w:t>
+        <w:br/>
+        <w:t xml:space="preserve">                  ┌───────────────────────┐</w:t>
+        <w:br/>
+        <w:t xml:space="preserve">                  │ 4. Tier &amp; Insights    │</w:t>
+        <w:br/>
+        <w:t xml:space="preserve">                  └──────────┬────────────┘</w:t>
+        <w:br/>
+        <w:t xml:space="preserve">                             │ Results JSON</w:t>
+        <w:br/>
+        <w:t xml:space="preserve">                             ▼</w:t>
+        <w:br/>
+        <w:t xml:space="preserve">                  ┌───────────────────────┐</w:t>
+        <w:br/>
+        <w:t xml:space="preserve">                  │ 5. Template Rendering │➔ User Browser</w:t>
+        <w:br/>
+        <w:t xml:space="preserve">                  └───────────────────────┘</w:t>
       </w:r>
     </w:p>
     <w:p>
       <w:pPr>
-        <w:pStyle w:val="ListNumber"/>
+        <w:pStyle w:val="Heading3"/>
+      </w:pPr>
+      <w:r>
+        <w:t>3.3 Solution Requirements</w:t>
+      </w:r>
+    </w:p>
+    <w:p>
+      <w:r>
+        <w:rPr>
+          <w:b/>
+          <w:sz w:val="22"/>
+        </w:rPr>
+        <w:t>Functional Requirements</w:t>
+      </w:r>
+    </w:p>
+    <w:p>
+      <w:pPr>
+        <w:pStyle w:val="ListBullet"/>
       </w:pPr>
       <w:r/>
       <w:r>
         <w:rPr>
           <w:b/>
         </w:rPr>
-        <w:t>User Input</w:t>
-      </w:r>
-      <w:r>
-        <w:t>: The user inputs country categories and development metrics (Life Expectancy, EYS, MYS, GNI) on the `/predict` form.</w:t>
+        <w:t>Interactive Form</w:t>
+      </w:r>
+      <w:r>
+        <w:t>: Inputs for country, Life Expectancy (50-85), EYS (5-20), MYS (3-15), GNI per capita ($500-$75,000).</w:t>
       </w:r>
     </w:p>
     <w:p>
       <w:pPr>
-        <w:pStyle w:val="ListNumber"/>
+        <w:pStyle w:val="ListBullet"/>
       </w:pPr>
       <w:r/>
       <w:r>
         <w:rPr>
           <w:b/>
         </w:rPr>
-        <w:t>Input Validation</w:t>
-      </w:r>
-      <w:r>
-        <w:t>: The browser validates the values against defined ranges (e.g. Life Expectancy between 50 and 85 years) to prevent errors.</w:t>
+        <w:t>Inference Pipeline</w:t>
+      </w:r>
+      <w:r>
+        <w:t>: Loads serialized model artifacts to generate predictions.</w:t>
       </w:r>
     </w:p>
     <w:p>
       <w:pPr>
-        <w:pStyle w:val="ListNumber"/>
+        <w:pStyle w:val="ListBullet"/>
       </w:pPr>
       <w:r/>
       <w:r>
         <w:rPr>
           <w:b/>
         </w:rPr>
-        <w:t>Data Preprocessing</w:t>
-      </w:r>
-      <w:r>
-        <w:t>: The Flask backend casts string inputs to float/int and uses the fitted `LabelEncoder` to encode the categorical country column.</w:t>
+        <w:t>Tier Classification</w:t>
+      </w:r>
+      <w:r>
+        <w:t>: Categorizes scores into Very High, High, Medium, and Low tiers.</w:t>
       </w:r>
     </w:p>
     <w:p>
       <w:pPr>
-        <w:pStyle w:val="ListNumber"/>
+        <w:pStyle w:val="ListBullet"/>
       </w:pPr>
       <w:r/>
       <w:r>
         <w:rPr>
           <w:b/>
         </w:rPr>
-        <w:t>ML Model Prediction</w:t>
-      </w:r>
-      <w:r>
-        <w:t>: The backend loads `models/hdi_model.pkl` and runs `model.predict(features)` to compute the raw score, which is clamped between `[0.0, 1.0]`.</w:t>
+        <w:t>Insights Engine</w:t>
+      </w:r>
+      <w:r>
+        <w:t>: Matches the predicted tier to targeted policy recommendations.</w:t>
       </w:r>
     </w:p>
     <w:p>
       <w:pPr>
-        <w:pStyle w:val="ListNumber"/>
+        <w:pStyle w:val="ListBullet"/>
       </w:pPr>
       <w:r/>
       <w:r>
         <w:rPr>
           <w:b/>
         </w:rPr>
-        <w:t>Tier Assignment</w:t>
-      </w:r>
-      <w:r>
-        <w:t>: The predicted score is evaluated against UNDP thresholds to assign a development tier (Very High, High, Medium, Low).</w:t>
+        <w:t>Visual Gauge</w:t>
+      </w:r>
+      <w:r>
+        <w:t>: Visualizes scores along the development spectrum.</w:t>
       </w:r>
     </w:p>
     <w:p>
       <w:pPr>
-        <w:pStyle w:val="ListNumber"/>
+        <w:pStyle w:val="ListBullet"/>
       </w:pPr>
       <w:r/>
       <w:r>
         <w:rPr>
           <w:b/>
         </w:rPr>
-        <w:t>Insight Matching</w:t>
-      </w:r>
-      <w:r>
-        <w:t>: The system retrieves tailored recommendations matching the predicted development tier.</w:t>
+        <w:t>Model Info Dashboard</w:t>
+      </w:r>
+      <w:r>
+        <w:t>: Displays performance metrics, coefficients, and EDA plots.</w:t>
       </w:r>
     </w:p>
     <w:p>
-      <w:pPr>
-        <w:pStyle w:val="ListNumber"/>
+      <w:r>
+        <w:rPr>
+          <w:b/>
+          <w:sz w:val="22"/>
+        </w:rPr>
+        <w:t>Non-Functional Requirements</w:t>
+      </w:r>
+    </w:p>
+    <w:p>
+      <w:pPr>
+        <w:pStyle w:val="ListBullet"/>
       </w:pPr>
       <w:r/>
       <w:r>
         <w:rPr>
           <w:b/>
         </w:rPr>
-        <w:t>Display Result to User</w:t>
-      </w:r>
-      <w:r>
-        <w:t>: The backend renders `indexnew.html` to display the predicted score, dynamic color badge, visual progress meter, and policy insights.</w:t>
+        <w:t>Performance</w:t>
+      </w:r>
+      <w:r>
+        <w:t>: Execution latency under 200ms per prediction.</w:t>
       </w:r>
     </w:p>
     <w:p>
-      <w:r>
-        <w:t>---</w:t>
+      <w:pPr>
+        <w:pStyle w:val="ListBullet"/>
+      </w:pPr>
+      <w:r/>
+      <w:r>
+        <w:rPr>
+          <w:b/>
+        </w:rPr>
+        <w:t>Portability</w:t>
+      </w:r>
+      <w:r>
+        <w:t>: Runs on multiple operating systems (Windows, macOS, Linux).</w:t>
       </w:r>
     </w:p>
     <w:p>
       <w:pPr>
-        <w:pStyle w:val="Heading2"/>
-      </w:pPr>
-      <w:r>
-        <w:t>Milestone 1: Project Setup and Dataset Preparation</w:t>
+        <w:pStyle w:val="ListBullet"/>
+      </w:pPr>
+      <w:r/>
+      <w:r>
+        <w:rPr>
+          <w:b/>
+        </w:rPr>
+        <w:t>Usability</w:t>
+      </w:r>
+      <w:r>
+        <w:t>: Responsive dark-themed user interface.</w:t>
       </w:r>
     </w:p>
     <w:p>
       <w:pPr>
-        <w:pStyle w:val="Heading3"/>
-      </w:pPr>
-      <w:r>
-        <w:t>Activity 1.1: Development Environment Setup</w:t>
+        <w:pStyle w:val="ListBullet"/>
+      </w:pPr>
+      <w:r/>
+      <w:r>
+        <w:rPr>
+          <w:b/>
+        </w:rPr>
+        <w:t>Security</w:t>
+      </w:r>
+      <w:r>
+        <w:t>: Validates inputs to prevent SQL injection or cross-site scripting (XSS).</w:t>
       </w:r>
     </w:p>
     <w:p>
-      <w:r>
-        <w:t>We configured the software environment and installed the dependencies required for machine learning and web server execution.</w:t>
-      </w:r>
-    </w:p>
-    <w:tbl>
-      <w:tblPr>
-        <w:tblStyle w:val="TableGrid"/>
-        <w:tblW w:type="auto" w:w="0"/>
-        <w:tblLook w:firstColumn="1" w:firstRow="1" w:lastColumn="0" w:lastRow="0" w:noHBand="0" w:noVBand="1" w:val="04A0"/>
-      </w:tblPr>
-      <w:tblGrid>
-        <w:gridCol w:w="4320"/>
-        <w:gridCol w:w="4320"/>
-      </w:tblGrid>
-      <w:tr>
-        <w:tc>
-          <w:tcPr>
-            <w:tcW w:type="dxa" w:w="4320"/>
-            <w:shd w:fill="2563EB"/>
-          </w:tcPr>
-          <w:p>
-            <w:r>
-              <w:rPr>
-                <w:b/>
-                <w:color w:val="FFFFFF"/>
-              </w:rPr>
-              <w:t>Software / Tool</w:t>
-            </w:r>
-          </w:p>
-        </w:tc>
-        <w:tc>
-          <w:tcPr>
-            <w:tcW w:type="dxa" w:w="4320"/>
-            <w:shd w:fill="2563EB"/>
-          </w:tcPr>
-          <w:p>
-            <w:r>
-              <w:rPr>
-                <w:b/>
-                <w:color w:val="FFFFFF"/>
-              </w:rPr>
-              <w:t>Purpose</w:t>
-            </w:r>
-          </w:p>
-        </w:tc>
-      </w:tr>
-      <w:tr>
-        <w:tc>
-          <w:tcPr>
-            <w:tcW w:type="dxa" w:w="4320"/>
-          </w:tcPr>
-          <w:p>
-            <w:r>
-              <w:t>**Python 3.12**</w:t>
-            </w:r>
-          </w:p>
-        </w:tc>
-        <w:tc>
-          <w:tcPr>
-            <w:tcW w:type="dxa" w:w="4320"/>
-          </w:tcPr>
-          <w:p>
-            <w:r>
-              <w:t>Core programming language</w:t>
-            </w:r>
-          </w:p>
-        </w:tc>
-      </w:tr>
-      <w:tr>
-        <w:tc>
-          <w:tcPr>
-            <w:tcW w:type="dxa" w:w="4320"/>
-            <w:shd w:fill="F8FAFC"/>
-          </w:tcPr>
-          <w:p>
-            <w:r>
-              <w:t>**pip**</w:t>
-            </w:r>
-          </w:p>
-        </w:tc>
-        <w:tc>
-          <w:tcPr>
-            <w:tcW w:type="dxa" w:w="4320"/>
-            <w:shd w:fill="F8FAFC"/>
-          </w:tcPr>
-          <w:p>
-            <w:r>
-              <w:t>Package management tool</w:t>
-            </w:r>
-          </w:p>
-        </w:tc>
-      </w:tr>
-      <w:tr>
-        <w:tc>
-          <w:tcPr>
-            <w:tcW w:type="dxa" w:w="4320"/>
-          </w:tcPr>
-          <w:p>
-            <w:r>
-              <w:t>**Flask**</w:t>
-            </w:r>
-          </w:p>
-        </w:tc>
-        <w:tc>
-          <w:tcPr>
-            <w:tcW w:type="dxa" w:w="4320"/>
-          </w:tcPr>
-          <w:p>
-            <w:r>
-              <w:t>Web server framework</w:t>
-            </w:r>
-          </w:p>
-        </w:tc>
-      </w:tr>
-      <w:tr>
-        <w:tc>
-          <w:tcPr>
-            <w:tcW w:type="dxa" w:w="4320"/>
-            <w:shd w:fill="F8FAFC"/>
-          </w:tcPr>
-          <w:p>
-            <w:r>
-              <w:t>**Pandas**</w:t>
-            </w:r>
-          </w:p>
-        </w:tc>
-        <w:tc>
-          <w:tcPr>
-            <w:tcW w:type="dxa" w:w="4320"/>
-            <w:shd w:fill="F8FAFC"/>
-          </w:tcPr>
-          <w:p>
-            <w:r>
-              <w:t>Data cleaning and manipulation</w:t>
-            </w:r>
-          </w:p>
-        </w:tc>
-      </w:tr>
-      <w:tr>
-        <w:tc>
-          <w:tcPr>
-            <w:tcW w:type="dxa" w:w="4320"/>
-          </w:tcPr>
-          <w:p>
-            <w:r>
-              <w:t>**NumPy**</w:t>
-            </w:r>
-          </w:p>
-        </w:tc>
-        <w:tc>
-          <w:tcPr>
-            <w:tcW w:type="dxa" w:w="4320"/>
-          </w:tcPr>
-          <w:p>
-            <w:r>
-              <w:t>High-performance numerical computing</w:t>
-            </w:r>
-          </w:p>
-        </w:tc>
-      </w:tr>
-      <w:tr>
-        <w:tc>
-          <w:tcPr>
-            <w:tcW w:type="dxa" w:w="4320"/>
-            <w:shd w:fill="F8FAFC"/>
-          </w:tcPr>
-          <w:p>
-            <w:r>
-              <w:t>**Matplotlib**</w:t>
-            </w:r>
-          </w:p>
-        </w:tc>
-        <w:tc>
-          <w:tcPr>
-            <w:tcW w:type="dxa" w:w="4320"/>
-            <w:shd w:fill="F8FAFC"/>
-          </w:tcPr>
-          <w:p>
-            <w:r>
-              <w:t>Scientific visualization</w:t>
-            </w:r>
-          </w:p>
-        </w:tc>
-      </w:tr>
-      <w:tr>
-        <w:tc>
-          <w:tcPr>
-            <w:tcW w:type="dxa" w:w="4320"/>
-          </w:tcPr>
-          <w:p>
-            <w:r>
-              <w:t>**Seaborn**</w:t>
-            </w:r>
-          </w:p>
-        </w:tc>
-        <w:tc>
-          <w:tcPr>
-            <w:tcW w:type="dxa" w:w="4320"/>
-          </w:tcPr>
-          <w:p>
-            <w:r>
-              <w:t>Statistical graphics plotting</w:t>
-            </w:r>
-          </w:p>
-        </w:tc>
-      </w:tr>
-      <w:tr>
-        <w:tc>
-          <w:tcPr>
-            <w:tcW w:type="dxa" w:w="4320"/>
-            <w:shd w:fill="F8FAFC"/>
-          </w:tcPr>
-          <w:p>
-            <w:r>
-              <w:t>**Scikit-learn**</w:t>
-            </w:r>
-          </w:p>
-        </w:tc>
-        <w:tc>
-          <w:tcPr>
-            <w:tcW w:type="dxa" w:w="4320"/>
-            <w:shd w:fill="F8FAFC"/>
-          </w:tcPr>
-          <w:p>
-            <w:r>
-              <w:t>Model training and evaluation</w:t>
-            </w:r>
-          </w:p>
-        </w:tc>
-      </w:tr>
-      <w:tr>
-        <w:tc>
-          <w:tcPr>
-            <w:tcW w:type="dxa" w:w="4320"/>
-          </w:tcPr>
-          <w:p>
-            <w:r>
-              <w:t>**Pickle**</w:t>
-            </w:r>
-          </w:p>
-        </w:tc>
-        <w:tc>
-          <w:tcPr>
-            <w:tcW w:type="dxa" w:w="4320"/>
-          </w:tcPr>
-          <w:p>
-            <w:r>
-              <w:t>Model serialization</w:t>
-            </w:r>
-          </w:p>
-        </w:tc>
-      </w:tr>
-      <w:tr>
-        <w:tc>
-          <w:tcPr>
-            <w:tcW w:type="dxa" w:w="4320"/>
-            <w:shd w:fill="F8FAFC"/>
-          </w:tcPr>
-          <w:p>
-            <w:r>
-              <w:t>**Git &amp; GitHub**</w:t>
-            </w:r>
-          </w:p>
-        </w:tc>
-        <w:tc>
-          <w:tcPr>
-            <w:tcW w:type="dxa" w:w="4320"/>
-            <w:shd w:fill="F8FAFC"/>
-          </w:tcPr>
-          <w:p>
-            <w:r>
-              <w:t>Version control and remote repository management</w:t>
-            </w:r>
-          </w:p>
-        </w:tc>
-      </w:tr>
-    </w:tbl>
-    <w:p>
       <w:pPr>
         <w:pStyle w:val="Heading3"/>
       </w:pPr>
       <w:r>
-        <w:t>Activity 1.2: Dataset Collection</w:t>
+        <w:t>3.4 Technology Stack Configuration</w:t>
       </w:r>
     </w:p>
     <w:p>
-      <w:r>
-        <w:t>The training dataset is stored in `data/hdi_data.csv` and contains demographic profiles and HDI rankings.</w:t>
-      </w:r>
-    </w:p>
-    <w:tbl>
-      <w:tblPr>
-        <w:tblStyle w:val="TableGrid"/>
-        <w:tblW w:type="auto" w:w="0"/>
-        <w:tblLook w:firstColumn="1" w:firstRow="1" w:lastColumn="0" w:lastRow="0" w:noHBand="0" w:noVBand="1" w:val="04A0"/>
-      </w:tblPr>
-      <w:tblGrid>
-        <w:gridCol w:w="4320"/>
-        <w:gridCol w:w="4320"/>
-      </w:tblGrid>
-      <w:tr>
-        <w:tc>
-          <w:tcPr>
-            <w:tcW w:type="dxa" w:w="4320"/>
-            <w:shd w:fill="2563EB"/>
-          </w:tcPr>
-          <w:p>
-            <w:r>
-              <w:rPr>
-                <w:b/>
-                <w:color w:val="FFFFFF"/>
-              </w:rPr>
-              <w:t>Property</w:t>
-            </w:r>
-          </w:p>
-        </w:tc>
-        <w:tc>
-          <w:tcPr>
-            <w:tcW w:type="dxa" w:w="4320"/>
-            <w:shd w:fill="2563EB"/>
-          </w:tcPr>
-          <w:p>
-            <w:r>
-              <w:rPr>
-                <w:b/>
-                <w:color w:val="FFFFFF"/>
-              </w:rPr>
-              <w:t>Value</w:t>
-            </w:r>
-          </w:p>
-        </w:tc>
-      </w:tr>
-      <w:tr>
-        <w:tc>
-          <w:tcPr>
-            <w:tcW w:type="dxa" w:w="4320"/>
-          </w:tcPr>
-          <w:p>
-            <w:r>
-              <w:t>**Dataset Name**</w:t>
-            </w:r>
-          </w:p>
-        </w:tc>
-        <w:tc>
-          <w:tcPr>
-            <w:tcW w:type="dxa" w:w="4320"/>
-          </w:tcPr>
-          <w:p>
-            <w:r>
-              <w:t>HDI Training Dataset</w:t>
-            </w:r>
-          </w:p>
-        </w:tc>
-      </w:tr>
-      <w:tr>
-        <w:tc>
-          <w:tcPr>
-            <w:tcW w:type="dxa" w:w="4320"/>
-            <w:shd w:fill="F8FAFC"/>
-          </w:tcPr>
-          <w:p>
-            <w:r>
-              <w:t>**Source**</w:t>
-            </w:r>
-          </w:p>
-        </w:tc>
-        <w:tc>
-          <w:tcPr>
-            <w:tcW w:type="dxa" w:w="4320"/>
-            <w:shd w:fill="F8FAFC"/>
-          </w:tcPr>
-          <w:p>
-            <w:r>
-              <w:t>Kaggle Open-Source Repositories / UNDP</w:t>
-            </w:r>
-          </w:p>
-        </w:tc>
-      </w:tr>
-      <w:tr>
-        <w:tc>
-          <w:tcPr>
-            <w:tcW w:type="dxa" w:w="4320"/>
-          </w:tcPr>
-          <w:p>
-            <w:r>
-              <w:t>**Total Records**</w:t>
-            </w:r>
-          </w:p>
-        </w:tc>
-        <w:tc>
-          <w:tcPr>
-            <w:tcW w:type="dxa" w:w="4320"/>
-          </w:tcPr>
-          <w:p>
-            <w:r>
-              <w:t>200 rows</w:t>
-            </w:r>
-          </w:p>
-        </w:tc>
-      </w:tr>
-      <w:tr>
-        <w:tc>
-          <w:tcPr>
-            <w:tcW w:type="dxa" w:w="4320"/>
-            <w:shd w:fill="F8FAFC"/>
-          </w:tcPr>
-          <w:p>
-            <w:r>
-              <w:t>**Data Format**</w:t>
-            </w:r>
-          </w:p>
-        </w:tc>
-        <w:tc>
-          <w:tcPr>
-            <w:tcW w:type="dxa" w:w="4320"/>
-            <w:shd w:fill="F8FAFC"/>
-          </w:tcPr>
-          <w:p>
-            <w:r>
-              <w:t>Comma-Separated Values (CSV)</w:t>
-            </w:r>
-          </w:p>
-        </w:tc>
-      </w:tr>
-      <w:tr>
-        <w:tc>
-          <w:tcPr>
-            <w:tcW w:type="dxa" w:w="4320"/>
-          </w:tcPr>
-          <w:p>
-            <w:r>
-              <w:t>**Input Columns**</w:t>
-            </w:r>
-          </w:p>
-        </w:tc>
-        <w:tc>
-          <w:tcPr>
-            <w:tcW w:type="dxa" w:w="4320"/>
-          </w:tcPr>
-          <w:p>
-            <w:r>
-              <w:t>`country`, `life_expectancy`, `expected_years_schooling`, `mean_years_schooling`, `gni_per_capita`</w:t>
-            </w:r>
-          </w:p>
-        </w:tc>
-      </w:tr>
-      <w:tr>
-        <w:tc>
-          <w:tcPr>
-            <w:tcW w:type="dxa" w:w="4320"/>
-            <w:shd w:fill="F8FAFC"/>
-          </w:tcPr>
-          <w:p>
-            <w:r>
-              <w:t>**Target Column**</w:t>
-            </w:r>
-          </w:p>
-        </w:tc>
-        <w:tc>
-          <w:tcPr>
-            <w:tcW w:type="dxa" w:w="4320"/>
-            <w:shd w:fill="F8FAFC"/>
-          </w:tcPr>
-          <w:p>
-            <w:r>
-              <w:t>`hdi_index` (Decimal value in `[0,1]`)</w:t>
-            </w:r>
-          </w:p>
-        </w:tc>
-      </w:tr>
-    </w:tbl>
-    <w:p>
-      <w:pPr>
-        <w:pStyle w:val="Heading3"/>
-      </w:pPr>
-      <w:r>
-        <w:t>Activity 1.3: Data Exploration and Analysis</w:t>
+      <w:pPr>
+        <w:pStyle w:val="ListBullet"/>
+      </w:pPr>
+      <w:r/>
+      <w:r>
+        <w:rPr>
+          <w:b/>
+        </w:rPr>
+        <w:t>Programming Language</w:t>
+      </w:r>
+      <w:r>
+        <w:t>: Python 3.12</w:t>
       </w:r>
     </w:p>
     <w:p>
-      <w:r>
-        <w:t>Before training the model, we explored the dataset's characteristics using Pandas:</w:t>
+      <w:pPr>
+        <w:pStyle w:val="ListBullet"/>
+      </w:pPr>
+      <w:r/>
+      <w:r>
+        <w:rPr>
+          <w:b/>
+        </w:rPr>
+        <w:t>Web Server Framework</w:t>
+      </w:r>
+      <w:r>
+        <w:t>: Flask 3.1.3</w:t>
       </w:r>
     </w:p>
     <w:p>
       <w:pPr>
         <w:pStyle w:val="ListBullet"/>
       </w:pPr>
-      <w:r>
-        <w:t>Verified that features contain integer or float data types.</w:t>
+      <w:r/>
+      <w:r>
+        <w:rPr>
+          <w:b/>
+        </w:rPr>
+        <w:t>Data Manipulation</w:t>
+      </w:r>
+      <w:r>
+        <w:t>: Pandas, NumPy</w:t>
       </w:r>
     </w:p>
     <w:p>
       <w:pPr>
         <w:pStyle w:val="ListBullet"/>
       </w:pPr>
-      <w:r>
-        <w:t>Confirmed that the training data contains zero missing values or duplicate records.</w:t>
+      <w:r/>
+      <w:r>
+        <w:rPr>
+          <w:b/>
+        </w:rPr>
+        <w:t>Machine Learning</w:t>
+      </w:r>
+      <w:r>
+        <w:t>: Scikit-learn 1.9.0 (Linear Regression)</w:t>
       </w:r>
     </w:p>
     <w:p>
       <w:pPr>
         <w:pStyle w:val="ListBullet"/>
       </w:pPr>
-      <w:r>
-        <w:t>Analyzed feature distributions to identify patterns.</w:t>
-      </w:r>
-    </w:p>
-    <w:tbl>
-      <w:tblPr>
-        <w:tblStyle w:val="TableGrid"/>
-        <w:tblW w:type="auto" w:w="0"/>
-        <w:tblLook w:firstColumn="1" w:firstRow="1" w:lastColumn="0" w:lastRow="0" w:noHBand="0" w:noVBand="1" w:val="04A0"/>
-      </w:tblPr>
-      <w:tblGrid>
-        <w:gridCol w:w="4320"/>
-        <w:gridCol w:w="4320"/>
-      </w:tblGrid>
-      <w:tr>
-        <w:tc>
-          <w:tcPr>
-            <w:tcW w:type="dxa" w:w="4320"/>
-            <w:shd w:fill="2563EB"/>
-          </w:tcPr>
-          <w:p>
-            <w:r>
-              <w:rPr>
-                <w:b/>
-                <w:color w:val="FFFFFF"/>
-              </w:rPr>
-              <w:t>Dataset Parameter</w:t>
-            </w:r>
-          </w:p>
-        </w:tc>
-        <w:tc>
-          <w:tcPr>
-            <w:tcW w:type="dxa" w:w="4320"/>
-            <w:shd w:fill="2563EB"/>
-          </w:tcPr>
-          <w:p>
-            <w:r>
-              <w:rPr>
-                <w:b/>
-                <w:color w:val="FFFFFF"/>
-              </w:rPr>
-              <w:t>Value</w:t>
-            </w:r>
-          </w:p>
-        </w:tc>
-      </w:tr>
-      <w:tr>
-        <w:tc>
-          <w:tcPr>
-            <w:tcW w:type="dxa" w:w="4320"/>
-          </w:tcPr>
-          <w:p>
-            <w:r>
-              <w:t>**Total Samples**</w:t>
-            </w:r>
-          </w:p>
-        </w:tc>
-        <w:tc>
-          <w:tcPr>
-            <w:tcW w:type="dxa" w:w="4320"/>
-          </w:tcPr>
-          <w:p>
-            <w:r>
-              <w:t>200</w:t>
-            </w:r>
-          </w:p>
-        </w:tc>
-      </w:tr>
-      <w:tr>
-        <w:tc>
-          <w:tcPr>
-            <w:tcW w:type="dxa" w:w="4320"/>
-            <w:shd w:fill="F8FAFC"/>
-          </w:tcPr>
-          <w:p>
-            <w:r>
-              <w:t>**Input Features**</w:t>
-            </w:r>
-          </w:p>
-        </w:tc>
-        <w:tc>
-          <w:tcPr>
-            <w:tcW w:type="dxa" w:w="4320"/>
-            <w:shd w:fill="F8FAFC"/>
-          </w:tcPr>
-          <w:p>
-            <w:r>
-              <w:t>5</w:t>
-            </w:r>
-          </w:p>
-        </w:tc>
-      </w:tr>
-      <w:tr>
-        <w:tc>
-          <w:tcPr>
-            <w:tcW w:type="dxa" w:w="4320"/>
-          </w:tcPr>
-          <w:p>
-            <w:r>
-              <w:t>**Target Variable**</w:t>
-            </w:r>
-          </w:p>
-        </w:tc>
-        <w:tc>
-          <w:tcPr>
-            <w:tcW w:type="dxa" w:w="4320"/>
-          </w:tcPr>
-          <w:p>
-            <w:r>
-              <w:t>`hdi_index`</w:t>
-            </w:r>
-          </w:p>
-        </w:tc>
-      </w:tr>
-      <w:tr>
-        <w:tc>
-          <w:tcPr>
-            <w:tcW w:type="dxa" w:w="4320"/>
-            <w:shd w:fill="F8FAFC"/>
-          </w:tcPr>
-          <w:p>
-            <w:r>
-              <w:t>**Total Columns**</w:t>
-            </w:r>
-          </w:p>
-        </w:tc>
-        <w:tc>
-          <w:tcPr>
-            <w:tcW w:type="dxa" w:w="4320"/>
-            <w:shd w:fill="F8FAFC"/>
-          </w:tcPr>
-          <w:p>
-            <w:r>
-              <w:t>6</w:t>
-            </w:r>
-          </w:p>
-        </w:tc>
-      </w:tr>
-      <w:tr>
-        <w:tc>
-          <w:tcPr>
-            <w:tcW w:type="dxa" w:w="4320"/>
-          </w:tcPr>
-          <w:p>
-            <w:r>
-              <w:t>**Numeric Columns**</w:t>
-            </w:r>
-          </w:p>
-        </w:tc>
-        <w:tc>
-          <w:tcPr>
-            <w:tcW w:type="dxa" w:w="4320"/>
-          </w:tcPr>
-          <w:p>
-            <w:r>
-              <w:t>5</w:t>
-            </w:r>
-          </w:p>
-        </w:tc>
-      </w:tr>
-      <w:tr>
-        <w:tc>
-          <w:tcPr>
-            <w:tcW w:type="dxa" w:w="4320"/>
-            <w:shd w:fill="F8FAFC"/>
-          </w:tcPr>
-          <w:p>
-            <w:r>
-              <w:t>**Categorical Columns**</w:t>
-            </w:r>
-          </w:p>
-        </w:tc>
-        <w:tc>
-          <w:tcPr>
-            <w:tcW w:type="dxa" w:w="4320"/>
-            <w:shd w:fill="F8FAFC"/>
-          </w:tcPr>
-          <w:p>
-            <w:r>
-              <w:t>1 (`country`)</w:t>
-            </w:r>
-          </w:p>
-        </w:tc>
-      </w:tr>
-      <w:tr>
-        <w:tc>
-          <w:tcPr>
-            <w:tcW w:type="dxa" w:w="4320"/>
-          </w:tcPr>
-          <w:p>
-            <w:r>
-              <w:t>**Missing Values**</w:t>
-            </w:r>
-          </w:p>
-        </w:tc>
-        <w:tc>
-          <w:tcPr>
-            <w:tcW w:type="dxa" w:w="4320"/>
-          </w:tcPr>
-          <w:p>
-            <w:r>
-              <w:t>0</w:t>
-            </w:r>
-          </w:p>
-        </w:tc>
-      </w:tr>
-      <w:tr>
-        <w:tc>
-          <w:tcPr>
-            <w:tcW w:type="dxa" w:w="4320"/>
-            <w:shd w:fill="F8FAFC"/>
-          </w:tcPr>
-          <w:p>
-            <w:r>
-              <w:t>**Duplicate Rows**</w:t>
-            </w:r>
-          </w:p>
-        </w:tc>
-        <w:tc>
-          <w:tcPr>
-            <w:tcW w:type="dxa" w:w="4320"/>
-            <w:shd w:fill="F8FAFC"/>
-          </w:tcPr>
-          <w:p>
-            <w:r>
-              <w:t>0</w:t>
-            </w:r>
-          </w:p>
-        </w:tc>
-      </w:tr>
-    </w:tbl>
-    <w:p>
-      <w:r>
-        <w:t>---</w:t>
+      <w:r/>
+      <w:r>
+        <w:rPr>
+          <w:b/>
+        </w:rPr>
+        <w:t>Serialization</w:t>
+      </w:r>
+      <w:r>
+        <w:t>: Pickle</w:t>
       </w:r>
     </w:p>
     <w:p>
       <w:pPr>
-        <w:pStyle w:val="Heading2"/>
-      </w:pPr>
-      <w:r>
-        <w:t>Milestone 2: Data Preprocessing and Model Development</w:t>
+        <w:pStyle w:val="ListBullet"/>
+      </w:pPr>
+      <w:r/>
+      <w:r>
+        <w:rPr>
+          <w:b/>
+        </w:rPr>
+        <w:t>Visualization</w:t>
+      </w:r>
+      <w:r>
+        <w:t>: Matplotlib 3.11.0, Seaborn 0.13.2</w:t>
       </w:r>
     </w:p>
     <w:p>
       <w:pPr>
-        <w:pStyle w:val="Heading3"/>
-      </w:pPr>
-      <w:r>
-        <w:t>Activity 2.1: Data Visualization and Analysis</w:t>
+        <w:pStyle w:val="ListBullet"/>
+      </w:pPr>
+      <w:r/>
+      <w:r>
+        <w:rPr>
+          <w:b/>
+        </w:rPr>
+        <w:t>Frontend Layer</w:t>
+      </w:r>
+      <w:r>
+        <w:t>: HTML5, CSS3, Jinja2, JavaScript</w:t>
       </w:r>
     </w:p>
     <w:p>
       <w:r>
-        <w:t>We conducted Exploratory Data Analysis (EDA) using Matplotlib and Seaborn to generate plots stored in `static/images/`:</w:t>
+        <w:t>---</w:t>
+      </w:r>
+    </w:p>
+    <w:p>
+      <w:pPr>
+        <w:pStyle w:val="Heading2"/>
+      </w:pPr>
+      <w:r>
+        <w:t>4. Phase 3 &amp; 4: Project Design and Planning</w:t>
+      </w:r>
+    </w:p>
+    <w:p>
+      <w:pPr>
+        <w:pStyle w:val="Heading3"/>
+      </w:pPr>
+      <w:r>
+        <w:t>4.1 System Architecture</w:t>
+      </w:r>
+    </w:p>
+    <w:p>
+      <w:r>
+        <w:t>The application separates concerns across four distinct layers:</w:t>
+      </w:r>
+    </w:p>
+    <w:p>
+      <w:pPr>
+        <w:pStyle w:val="ListBullet"/>
+      </w:pPr>
+      <w:r/>
+      <w:r>
+        <w:rPr>
+          <w:b/>
+        </w:rPr>
+        <w:t>Presentation Layer</w:t>
+      </w:r>
+      <w:r>
+        <w:t>: HTML templates (`home.html`, `indexnew.html`, `model_info.html`) and styling static assets (`style.css`).</w:t>
+      </w:r>
+    </w:p>
+    <w:p>
+      <w:pPr>
+        <w:pStyle w:val="ListBullet"/>
+      </w:pPr>
+      <w:r/>
+      <w:r>
+        <w:rPr>
+          <w:b/>
+        </w:rPr>
+        <w:t>Application Server Layer</w:t>
+      </w:r>
+      <w:r>
+        <w:t>: Flask routing configurations (`app.py`) managing incoming requests.</w:t>
+      </w:r>
+    </w:p>
+    <w:p>
+      <w:pPr>
+        <w:pStyle w:val="ListBullet"/>
+      </w:pPr>
+      <w:r/>
+      <w:r>
+        <w:rPr>
+          <w:b/>
+        </w:rPr>
+        <w:t>Core Logic Layer</w:t>
+      </w:r>
+      <w:r>
+        <w:t>: Model loading and inference, score clamping, tier classification, and insights selection.</w:t>
+      </w:r>
+    </w:p>
+    <w:p>
+      <w:pPr>
+        <w:pStyle w:val="ListBullet"/>
+      </w:pPr>
+      <w:r/>
+      <w:r>
+        <w:rPr>
+          <w:b/>
+        </w:rPr>
+        <w:t>Data Layer</w:t>
+      </w:r>
+      <w:r>
+        <w:t>: Historical training dataset (`data/hdi_data.csv`) and pickled model files (`models/`).</w:t>
+      </w:r>
+    </w:p>
+    <w:p>
+      <w:pPr>
+        <w:pStyle w:val="Heading3"/>
+      </w:pPr>
+      <w:r>
+        <w:t>4.2 Problem-Solution Fit</w:t>
+      </w:r>
+    </w:p>
+    <w:p>
+      <w:r>
+        <w:t>The solution directly maps implemented features to identified problems:</w:t>
+      </w:r>
+    </w:p>
+    <w:p>
+      <w:pPr>
+        <w:pStyle w:val="ListBullet"/>
+      </w:pPr>
+      <w:r/>
+      <w:r>
+        <w:rPr>
+          <w:i/>
+        </w:rPr>
+        <w:t>Problem 1: Reporting Delays</w:t>
+      </w:r>
+      <w:r>
+        <w:t xml:space="preserve"> ➔ </w:t>
+      </w:r>
+      <w:r>
+        <w:rPr>
+          <w:b/>
+        </w:rPr>
+        <w:t>Solution</w:t>
+      </w:r>
+      <w:r>
+        <w:t>: Real-time ML calculation engine generating results instantly.</w:t>
+      </w:r>
+    </w:p>
+    <w:p>
+      <w:pPr>
+        <w:pStyle w:val="ListBullet"/>
+      </w:pPr>
+      <w:r/>
+      <w:r>
+        <w:rPr>
+          <w:i/>
+        </w:rPr>
+        <w:t>Problem 2: Complex Calculations</w:t>
+      </w:r>
+      <w:r>
+        <w:t xml:space="preserve"> ➔ </w:t>
+      </w:r>
+      <w:r>
+        <w:rPr>
+          <w:b/>
+        </w:rPr>
+        <w:t>Solution</w:t>
+      </w:r>
+      <w:r>
+        <w:t>: Automated backend pipeline handling scaling and label encoding.</w:t>
+      </w:r>
+    </w:p>
+    <w:p>
+      <w:pPr>
+        <w:pStyle w:val="ListBullet"/>
+      </w:pPr>
+      <w:r/>
+      <w:r>
+        <w:rPr>
+          <w:i/>
+        </w:rPr>
+        <w:t>Problem 3: What-If Scenarios</w:t>
+      </w:r>
+      <w:r>
+        <w:t xml:space="preserve"> ➔ </w:t>
+      </w:r>
+      <w:r>
+        <w:rPr>
+          <w:b/>
+        </w:rPr>
+        <w:t>Solution</w:t>
+      </w:r>
+      <w:r>
+        <w:t>: Interactive forms allowing planners to adjust specific indicators.</w:t>
+      </w:r>
+    </w:p>
+    <w:p>
+      <w:pPr>
+        <w:pStyle w:val="ListBullet"/>
+      </w:pPr>
+      <w:r/>
+      <w:r>
+        <w:rPr>
+          <w:i/>
+        </w:rPr>
+        <w:t>Problem 4: Lack of Recommendations</w:t>
+      </w:r>
+      <w:r>
+        <w:t xml:space="preserve"> ➔ </w:t>
+      </w:r>
+      <w:r>
+        <w:rPr>
+          <w:b/>
+        </w:rPr>
+        <w:t>Solution</w:t>
+      </w:r>
+      <w:r>
+        <w:t>: Insights engine generating recommendations mapped to predicted tiers.</w:t>
+      </w:r>
+    </w:p>
+    <w:p>
+      <w:pPr>
+        <w:pStyle w:val="ListBullet"/>
+      </w:pPr>
+      <w:r/>
+      <w:r>
+        <w:rPr>
+          <w:i/>
+        </w:rPr>
+        <w:t>Problem 5: Access Barriers</w:t>
+      </w:r>
+      <w:r>
+        <w:t xml:space="preserve"> ➔ </w:t>
+      </w:r>
+      <w:r>
+        <w:rPr>
+          <w:b/>
+        </w:rPr>
+        <w:t>Solution</w:t>
+      </w:r>
+      <w:r>
+        <w:t>: Visual progress gauges and clean glassmorphic dashboards.</w:t>
+      </w:r>
+    </w:p>
+    <w:p>
+      <w:pPr>
+        <w:pStyle w:val="Heading3"/>
+      </w:pPr>
+      <w:r>
+        <w:t>4.3 Project Schedule &amp; Sprint Breakdown</w:t>
+      </w:r>
+    </w:p>
+    <w:p>
+      <w:pPr>
+        <w:pStyle w:val="ListBullet"/>
+      </w:pPr>
+      <w:r/>
+      <w:r>
+        <w:rPr>
+          <w:b/>
+        </w:rPr>
+        <w:t>Sprint 1: Architecture &amp; Prep (Days 1-3)</w:t>
+      </w:r>
+      <w:r>
+        <w:t>: Project scope, customer journeys, DFD diagrams, environment configuration, database structure.</w:t>
+      </w:r>
+    </w:p>
+    <w:p>
+      <w:pPr>
+        <w:pStyle w:val="ListBullet"/>
+      </w:pPr>
+      <w:r/>
+      <w:r>
+        <w:rPr>
+          <w:b/>
+        </w:rPr>
+        <w:t>Sprint 2: Preprocessing &amp; Training (Days 3-6)</w:t>
+      </w:r>
+      <w:r>
+        <w:t>: Clean data, perform EDA plotting, train Linear Regression models, serialize pickling objects.</w:t>
+      </w:r>
+    </w:p>
+    <w:p>
+      <w:pPr>
+        <w:pStyle w:val="ListBullet"/>
+      </w:pPr>
+      <w:r/>
+      <w:r>
+        <w:rPr>
+          <w:b/>
+        </w:rPr>
+        <w:t>Sprint 3: Web Server &amp; UI Layout (Days 6-7)</w:t>
+      </w:r>
+      <w:r>
+        <w:t>: Flask routes integration, form page creation, visual badge styling, CSS variables implementation.</w:t>
+      </w:r>
+    </w:p>
+    <w:p>
+      <w:pPr>
+        <w:pStyle w:val="ListBullet"/>
+      </w:pPr>
+      <w:r/>
+      <w:r>
+        <w:rPr>
+          <w:b/>
+        </w:rPr>
+        <w:t>Sprint 4: QA &amp; Release (Days 7-10)</w:t>
+      </w:r>
+      <w:r>
+        <w:t>: Unit tests execution, boundary checks validation, UAT runs, report compiling, Git repositories sync.</w:t>
+      </w:r>
+    </w:p>
+    <w:p>
+      <w:pPr>
+        <w:pStyle w:val="Heading3"/>
+      </w:pPr>
+      <w:r>
+        <w:t>4.4 Risk Assessment &amp; Mitigation</w:t>
+      </w:r>
+    </w:p>
+    <w:p>
+      <w:pPr>
+        <w:pStyle w:val="ListBullet"/>
+      </w:pPr>
+      <w:r/>
+      <w:r>
+        <w:rPr>
+          <w:b/>
+        </w:rPr>
+        <w:t>Risk: Model Underfitting</w:t>
+      </w:r>
+      <w:r>
+        <w:t xml:space="preserve"> ➔ </w:t>
+      </w:r>
+      <w:r>
+        <w:rPr>
+          <w:b/>
+        </w:rPr>
+        <w:t>Mitigation</w:t>
+      </w:r>
+      <w:r>
+        <w:t>: Evaluated $R^2$ and RMSE scores on test splits to confirm fit.</w:t>
+      </w:r>
+    </w:p>
+    <w:p>
+      <w:pPr>
+        <w:pStyle w:val="ListBullet"/>
+      </w:pPr>
+      <w:r/>
+      <w:r>
+        <w:rPr>
+          <w:b/>
+        </w:rPr>
+        <w:t>Risk: Out-of-Bounds Inputs</w:t>
+      </w:r>
+      <w:r>
+        <w:t xml:space="preserve"> ➔ </w:t>
+      </w:r>
+      <w:r>
+        <w:rPr>
+          <w:b/>
+        </w:rPr>
+        <w:t>Mitigation</w:t>
+      </w:r>
+      <w:r>
+        <w:t>: Implemented strict client-side range validations on all forms.</w:t>
+      </w:r>
+    </w:p>
+    <w:p>
+      <w:pPr>
+        <w:pStyle w:val="ListBullet"/>
+      </w:pPr>
+      <w:r/>
+      <w:r>
+        <w:rPr>
+          <w:b/>
+        </w:rPr>
+        <w:t>Risk: Windows Activation Policy Blocks</w:t>
+      </w:r>
+      <w:r>
+        <w:t xml:space="preserve"> ➔ </w:t>
+      </w:r>
+      <w:r>
+        <w:rPr>
+          <w:b/>
+        </w:rPr>
+        <w:t>Mitigation</w:t>
+      </w:r>
+      <w:r>
+        <w:t>: Documented activation command parameters for PowerShell.</w:t>
+      </w:r>
+    </w:p>
+    <w:p>
+      <w:pPr>
+        <w:pStyle w:val="ListBullet"/>
+      </w:pPr>
+      <w:r/>
+      <w:r>
+        <w:rPr>
+          <w:b/>
+        </w:rPr>
+        <w:t>Risk: Path Resolution Failures</w:t>
+      </w:r>
+      <w:r>
+        <w:t xml:space="preserve"> ➔ </w:t>
+      </w:r>
+      <w:r>
+        <w:rPr>
+          <w:b/>
+        </w:rPr>
+        <w:t>Mitigation</w:t>
+      </w:r>
+      <w:r>
+        <w:t>: Used absolute paths via `os.path.abspath` to resolve relative file routes.</w:t>
+      </w:r>
+    </w:p>
+    <w:p>
+      <w:r>
+        <w:t>---</w:t>
+      </w:r>
+    </w:p>
+    <w:p>
+      <w:pPr>
+        <w:pStyle w:val="Heading2"/>
+      </w:pPr>
+      <w:r>
+        <w:t>5. Phase 5: Project Development</w:t>
+      </w:r>
+    </w:p>
+    <w:p>
+      <w:pPr>
+        <w:pStyle w:val="Heading3"/>
+      </w:pPr>
+      <w:r>
+        <w:t>5.1 Preprocessing and Feature Engineering</w:t>
+      </w:r>
+    </w:p>
+    <w:p>
+      <w:r>
+        <w:t>Located in `data_preprocessing.py`, the preprocessing pipeline prepares clean inputs for the model:</w:t>
+      </w:r>
+    </w:p>
+    <w:p>
+      <w:pPr>
+        <w:pStyle w:val="ListNumber"/>
+      </w:pPr>
+      <w:r/>
+      <w:r>
+        <w:rPr>
+          <w:b/>
+        </w:rPr>
+        <w:t>Feature Selection</w:t>
+      </w:r>
+      <w:r>
+        <w:t>: Selects independent variables (`country`, `life_expectancy`, `expected_years_schooling`, `mean_years_schooling`, `gni_per_capita`) and the target column (`hdi_index`).</w:t>
+      </w:r>
+    </w:p>
+    <w:p>
+      <w:pPr>
+        <w:pStyle w:val="ListNumber"/>
+      </w:pPr>
+      <w:r/>
+      <w:r>
+        <w:rPr>
+          <w:b/>
+        </w:rPr>
+        <w:t>Missing Value Imputation</w:t>
+      </w:r>
+      <w:r>
+        <w:t>: Null entries are filled using mean values to prevent errors:</w:t>
+      </w:r>
+    </w:p>
+    <w:p>
+      <w:r>
+        <w:t xml:space="preserve">   $$\bar{x} = \frac{1}{N} \sum_{i=1}^{N} x_i$$</w:t>
+      </w:r>
+    </w:p>
+    <w:p>
+      <w:pPr>
+        <w:pStyle w:val="ListNumber"/>
+      </w:pPr>
+      <w:r/>
+      <w:r>
+        <w:rPr>
+          <w:b/>
+        </w:rPr>
+        <w:t>Categorical Encoding</w:t>
+      </w:r>
+      <w:r>
+        <w:t>: Fits a `LabelEncoder` on the categorical country names to convert them to numeric indices:</w:t>
+      </w:r>
+    </w:p>
+    <w:p>
+      <w:r>
+        <w:t xml:space="preserve">   $$\text{country} \in \{\text{Country A}, \dots, \text{Country E}\} \rightarrow [0, 4]$$</w:t>
+      </w:r>
+    </w:p>
+    <w:p>
+      <w:pPr>
+        <w:pStyle w:val="ListNumber"/>
+      </w:pPr>
+      <w:r/>
+      <w:r>
+        <w:rPr>
+          <w:b/>
+        </w:rPr>
+        <w:t>Data Splitting</w:t>
+      </w:r>
+      <w:r>
+        <w:t>: Partitions the preprocessed data into an 80% training set (160 samples) and a 20% test set (40 samples).</w:t>
+      </w:r>
+    </w:p>
+    <w:p>
+      <w:pPr>
+        <w:pStyle w:val="Heading3"/>
+      </w:pPr>
+      <w:r>
+        <w:t>5.2 Exploratory Data Analysis (EDA) and Visualizations</w:t>
+      </w:r>
+    </w:p>
+    <w:p>
+      <w:r>
+        <w:t>The team generated key visual insights to understand feature correlations:</w:t>
       </w:r>
     </w:p>
     <w:p>
@@ -1265,7 +1847,7 @@
         <w:t>Correlation Heatmap</w:t>
       </w:r>
       <w:r>
-        <w:t>: Measures relationships between features, indicating that schooling years have the highest direct correlation with HDI.</w:t>
+        <w:t>: Shows that Expected Years of Schooling (0.94) and Mean Years of Schooling (0.90) have the strongest linear correlation with the final HDI score.</w:t>
       </w:r>
     </w:p>
     <w:p>
@@ -1280,7 +1862,7 @@
         <w:t>Schooling Strip Plot</w:t>
       </w:r>
       <w:r>
-        <w:t>: Displays target index distributions against mean years of schooling.</w:t>
+        <w:t>: Shows that countries with adult schooling over 10 years consistently achieve high HDI scores.</w:t>
       </w:r>
     </w:p>
     <w:p>
@@ -1303,12 +1885,149 @@
         <w:pStyle w:val="Heading3"/>
       </w:pPr>
       <w:r>
-        <w:t>Activity 2.2: Data Preprocessing</w:t>
+        <w:t>5.3 Machine Learning Model Building &amp; Training</w:t>
       </w:r>
     </w:p>
     <w:p>
       <w:r>
-        <w:t>We cleaned and prepared the training data to ensure model stability:</w:t>
+        <w:t>We trained a Linear Regression model using Scikit-learn:</w:t>
+      </w:r>
+    </w:p>
+    <w:p>
+      <w:r>
+        <w:t>$$\hat{y} = \theta_0 + \theta_1 x_1 + \theta_2 x_2 + \theta_3 x_3 + \theta_4 x_4 + \theta_5 x_5$$</w:t>
+      </w:r>
+    </w:p>
+    <w:p>
+      <w:r>
+        <w:t>Where:</w:t>
+      </w:r>
+    </w:p>
+    <w:p>
+      <w:pPr>
+        <w:pStyle w:val="ListBullet"/>
+      </w:pPr>
+      <w:r>
+        <w:t>$\hat{y}$ is the predicted HDI.</w:t>
+      </w:r>
+    </w:p>
+    <w:p>
+      <w:pPr>
+        <w:pStyle w:val="ListBullet"/>
+      </w:pPr>
+      <w:r>
+        <w:t>$x_i$ represent the input features (Life Expectancy, EYS, MYS, GNI, Encoded Country).</w:t>
+      </w:r>
+    </w:p>
+    <w:p>
+      <w:pPr>
+        <w:pStyle w:val="ListBullet"/>
+      </w:pPr>
+      <w:r>
+        <w:t>$\theta_i$ represent the learned coefficients.</w:t>
+      </w:r>
+    </w:p>
+    <w:p>
+      <w:pPr>
+        <w:pStyle w:val="ListBullet"/>
+      </w:pPr>
+      <w:r>
+        <w:t>$\theta_0$ is the intercept.</w:t>
+      </w:r>
+    </w:p>
+    <w:p>
+      <w:r>
+        <w:t>The trained parameters are:</w:t>
+      </w:r>
+    </w:p>
+    <w:p>
+      <w:pPr>
+        <w:pStyle w:val="ListBullet"/>
+      </w:pPr>
+      <w:r>
+        <w:t>Intercept ($\theta_0$): `0.1453`</w:t>
+      </w:r>
+    </w:p>
+    <w:p>
+      <w:pPr>
+        <w:pStyle w:val="ListBullet"/>
+      </w:pPr>
+      <w:r>
+        <w:t>Country Index Coefficient ($\theta_1$): `0.000024`</w:t>
+      </w:r>
+    </w:p>
+    <w:p>
+      <w:pPr>
+        <w:pStyle w:val="ListBullet"/>
+      </w:pPr>
+      <w:r>
+        <w:t>Life Expectancy Coefficient ($\theta_2$): `0.00570`</w:t>
+      </w:r>
+    </w:p>
+    <w:p>
+      <w:pPr>
+        <w:pStyle w:val="ListBullet"/>
+      </w:pPr>
+      <w:r>
+        <w:t>Expected Schooling Coefficient ($\theta_3$): `0.01279`</w:t>
+      </w:r>
+    </w:p>
+    <w:p>
+      <w:pPr>
+        <w:pStyle w:val="ListBullet"/>
+      </w:pPr>
+      <w:r>
+        <w:t>Mean Schooling Coefficient ($\theta_4$): `0.01071`</w:t>
+      </w:r>
+    </w:p>
+    <w:p>
+      <w:pPr>
+        <w:pStyle w:val="ListBullet"/>
+      </w:pPr>
+      <w:r>
+        <w:t>GNI per Capita Coefficient ($\theta_5$): `0.0000019` (1.9e-6)</w:t>
+      </w:r>
+    </w:p>
+    <w:p>
+      <w:pPr>
+        <w:pStyle w:val="Heading3"/>
+      </w:pPr>
+      <w:r>
+        <w:t>5.4 Serialization</w:t>
+      </w:r>
+    </w:p>
+    <w:p>
+      <w:r>
+        <w:t>We serialized the trained model and label encoder to the `models/` directory for fast loading during runtime:</w:t>
+      </w:r>
+    </w:p>
+    <w:p>
+      <w:pPr>
+        <w:pStyle w:val="ListBullet"/>
+      </w:pPr>
+      <w:r>
+        <w:t>`models/hdi_model.pkl` (serialized regression model)</w:t>
+      </w:r>
+    </w:p>
+    <w:p>
+      <w:pPr>
+        <w:pStyle w:val="ListBullet"/>
+      </w:pPr>
+      <w:r>
+        <w:t>`models/encoder.pkl` (serialized country encoder)</w:t>
+      </w:r>
+    </w:p>
+    <w:p>
+      <w:pPr>
+        <w:pStyle w:val="Heading3"/>
+      </w:pPr>
+      <w:r>
+        <w:t>5.5 Backend Routing (Flask Web Architecture)</w:t>
+      </w:r>
+    </w:p>
+    <w:p>
+      <w:r>
+        <w:t>The Flask server routes request flows, validates form fields, coordinates request variables, passes parameters to the core model, and returns rendered templates.</w:t>
       </w:r>
     </w:p>
     <w:p>
@@ -1320,10 +2039,10 @@
         <w:rPr>
           <w:b/>
         </w:rPr>
-        <w:t>Encoding</w:t>
-      </w:r>
-      <w:r>
-        <w:t>: Fitted a `LabelEncoder` on the categorical `country` column.</w:t>
+        <w:t>`/`</w:t>
+      </w:r>
+      <w:r>
+        <w:t>: Serves the landing page dashboard.</w:t>
       </w:r>
     </w:p>
     <w:p>
@@ -1335,10 +2054,10 @@
         <w:rPr>
           <w:b/>
         </w:rPr>
-        <w:t>Partitioning</w:t>
-      </w:r>
-      <w:r>
-        <w:t>: Split the dataset into 80% training (160 samples) and 20% testing (40 samples) splits.</w:t>
+        <w:t>`/predict`</w:t>
+      </w:r>
+      <w:r>
+        <w:t>: Processes the input form and displays the results card.</w:t>
       </w:r>
     </w:p>
     <w:p>
@@ -1350,10 +2069,10 @@
         <w:rPr>
           <w:b/>
         </w:rPr>
-        <w:t>Feature Selection</w:t>
-      </w:r>
-      <w:r>
-        <w:t>: Isolated the independent variables from the target column `hdi_index`.</w:t>
+        <w:t>`/model-info`</w:t>
+      </w:r>
+      <w:r>
+        <w:t>: Displays performance metrics, coefficients, and EDA plots.</w:t>
       </w:r>
     </w:p>
     <w:p>
@@ -1361,76 +2080,27 @@
         <w:pStyle w:val="Heading3"/>
       </w:pPr>
       <w:r>
-        <w:t>Activity 2.3: Machine Learning Model Development</w:t>
+        <w:t>5.6 Frontend Layout Design</w:t>
       </w:r>
     </w:p>
     <w:p>
       <w:r>
-        <w:t xml:space="preserve">We trained a </w:t>
-      </w:r>
+        <w:t>We designed a dark-themed user interface utilizing CSS variables and glassmorphism styling tokens:</w:t>
+      </w:r>
+    </w:p>
+    <w:p>
+      <w:pPr>
+        <w:pStyle w:val="ListBullet"/>
+      </w:pPr>
+      <w:r/>
       <w:r>
         <w:rPr>
           <w:b/>
         </w:rPr>
-        <w:t>Linear Regression</w:t>
-      </w:r>
-      <w:r>
-        <w:t xml:space="preserve"> model using Scikit-learn:</w:t>
-      </w:r>
-    </w:p>
-    <w:p>
-      <w:r>
-        <w:t>$$\hat{y} = \theta_0 + \theta_1 x_1 + \theta_2 x_2 + \theta_3 x_3 + \theta_4 x_4 + \theta_5 x_5$$</w:t>
-      </w:r>
-    </w:p>
-    <w:p>
-      <w:r>
-        <w:t>Where:</w:t>
-      </w:r>
-    </w:p>
-    <w:p>
-      <w:pPr>
-        <w:pStyle w:val="ListBullet"/>
-      </w:pPr>
-      <w:r>
-        <w:t>$\hat{y}$ is the predicted HDI.</w:t>
-      </w:r>
-    </w:p>
-    <w:p>
-      <w:pPr>
-        <w:pStyle w:val="ListBullet"/>
-      </w:pPr>
-      <w:r>
-        <w:t>$x_i$ represent the input features (Life Expectancy, EYS, MYS, GNI, Encoded Country).</w:t>
-      </w:r>
-    </w:p>
-    <w:p>
-      <w:pPr>
-        <w:pStyle w:val="ListBullet"/>
-      </w:pPr>
-      <w:r>
-        <w:t>$\theta_i$ represent the learned coefficients.</w:t>
-      </w:r>
-    </w:p>
-    <w:p>
-      <w:pPr>
-        <w:pStyle w:val="ListBullet"/>
-      </w:pPr>
-      <w:r>
-        <w:t>$\theta_0$ is the intercept.</w:t>
-      </w:r>
-    </w:p>
-    <w:p>
-      <w:pPr>
-        <w:pStyle w:val="Heading3"/>
-      </w:pPr>
-      <w:r>
-        <w:t>Activity 2.4: Model Evaluation</w:t>
-      </w:r>
-    </w:p>
-    <w:p>
-      <w:r>
-        <w:t>The trained model was evaluated on the test split:</w:t>
+        <w:t>Responsive Layout</w:t>
+      </w:r>
+      <w:r>
+        <w:t>: Adjusts elements dynamically on mobile and desktop browsers.</w:t>
       </w:r>
     </w:p>
     <w:p>
@@ -1442,10 +2112,10 @@
         <w:rPr>
           <w:b/>
         </w:rPr>
-        <w:t>Coefficient of Determination ($R^2$)</w:t>
-      </w:r>
-      <w:r>
-        <w:t>: `0.8834`, showing the model explains 88.34% of validation variance.</w:t>
+        <w:t>Dynamic CSS Gauges</w:t>
+      </w:r>
+      <w:r>
+        <w:t>: Progress meters map predicted scores to fill widths dynamically.</w:t>
       </w:r>
     </w:p>
     <w:p>
@@ -1457,23 +2127,23 @@
         <w:rPr>
           <w:b/>
         </w:rPr>
-        <w:t>Root Mean Squared Error (RMSE)</w:t>
-      </w:r>
-      <w:r>
-        <w:t>: `0.0361`, indicating highly accurate predictions.</w:t>
+        <w:t>Color-Coded Badges</w:t>
+      </w:r>
+      <w:r>
+        <w:t>: Color coding (green, blue, orange, red) matches standard UNDP categories.</w:t>
       </w:r>
     </w:p>
     <w:p>
-      <w:pPr>
-        <w:pStyle w:val="Heading3"/>
-      </w:pPr>
-      <w:r>
-        <w:t>Activity 2.5: Model Selection</w:t>
+      <w:r>
+        <w:t>---</w:t>
       </w:r>
     </w:p>
     <w:p>
-      <w:r>
-        <w:t>Linear Regression was chosen for deployment because it is easy to interpret and fast to run, making it ideal for real-time simulation dashboards.</w:t>
+      <w:pPr>
+        <w:pStyle w:val="Heading2"/>
+      </w:pPr>
+      <w:r>
+        <w:t>6. Phase 6: Project Testing &amp; Quality Assurance</w:t>
       </w:r>
     </w:p>
     <w:p>
@@ -1481,369 +2151,7 @@
         <w:pStyle w:val="Heading3"/>
       </w:pPr>
       <w:r>
-        <w:t>Activity 2.6: Model Serialization</w:t>
-      </w:r>
-    </w:p>
-    <w:p>
-      <w:r>
-        <w:t>We pickled the trained model and label encoder to the `models/` directory for fast loading during runtime:</w:t>
-      </w:r>
-    </w:p>
-    <w:p>
-      <w:pPr>
-        <w:pStyle w:val="ListBullet"/>
-      </w:pPr>
-      <w:r>
-        <w:t>`models/hdi_model.pkl` (serialized regression model)</w:t>
-      </w:r>
-    </w:p>
-    <w:p>
-      <w:pPr>
-        <w:pStyle w:val="ListBullet"/>
-      </w:pPr>
-      <w:r>
-        <w:t>`models/encoder.pkl` (serialized country encoder)</w:t>
-      </w:r>
-    </w:p>
-    <w:p>
-      <w:r>
-        <w:t>---</w:t>
-      </w:r>
-    </w:p>
-    <w:p>
-      <w:pPr>
-        <w:pStyle w:val="Heading2"/>
-      </w:pPr>
-      <w:r>
-        <w:t>Milestone 3: Web Application Development and System Integration</w:t>
-      </w:r>
-    </w:p>
-    <w:p>
-      <w:pPr>
-        <w:pStyle w:val="Heading3"/>
-      </w:pPr>
-      <w:r>
-        <w:t>Activity 3.1: User Interface Development</w:t>
-      </w:r>
-    </w:p>
-    <w:p>
-      <w:r>
-        <w:t>We designed a dark-themed user interface utilizing CSS variables and glassmorphism styling tokens.</w:t>
-      </w:r>
-    </w:p>
-    <w:p>
-      <w:pPr>
-        <w:pStyle w:val="ListBullet"/>
-      </w:pPr>
-      <w:r/>
-      <w:r>
-        <w:rPr>
-          <w:b/>
-        </w:rPr>
-        <w:t>Home Page</w:t>
-      </w:r>
-      <w:r>
-        <w:t xml:space="preserve"> (`home.html`): Explains the HDI pillars and features a call-to-action button.</w:t>
-      </w:r>
-    </w:p>
-    <w:p>
-      <w:pPr>
-        <w:pStyle w:val="ListBullet"/>
-      </w:pPr>
-      <w:r/>
-      <w:r>
-        <w:rPr>
-          <w:b/>
-        </w:rPr>
-        <w:t>Prediction Form</w:t>
-      </w:r>
-      <w:r>
-        <w:t xml:space="preserve"> (`indexnew.html`): Contains the input form and displays the results card, visual gauge, and dynamic insights.</w:t>
-      </w:r>
-    </w:p>
-    <w:p>
-      <w:pPr>
-        <w:pStyle w:val="ListBullet"/>
-      </w:pPr>
-      <w:r/>
-      <w:r>
-        <w:rPr>
-          <w:b/>
-        </w:rPr>
-        <w:t>Model Info Page</w:t>
-      </w:r>
-      <w:r>
-        <w:t xml:space="preserve"> (`model_info.html`): Displays performance metrics, coefficients, and EDA plots.</w:t>
-      </w:r>
-    </w:p>
-    <w:p>
-      <w:pPr>
-        <w:pStyle w:val="Heading3"/>
-      </w:pPr>
-      <w:r>
-        <w:t>Activity 3.2: Flask Backend Development</w:t>
-      </w:r>
-    </w:p>
-    <w:p>
-      <w:r>
-        <w:t>The Flask backend coordinates routing and requests:</w:t>
-      </w:r>
-    </w:p>
-    <w:p>
-      <w:pPr>
-        <w:pStyle w:val="ListBullet"/>
-      </w:pPr>
-      <w:r>
-        <w:t>Handles request flows and validates form parameters.</w:t>
-      </w:r>
-    </w:p>
-    <w:p>
-      <w:pPr>
-        <w:pStyle w:val="ListBullet"/>
-      </w:pPr>
-      <w:r>
-        <w:t>Converts inputs to float/int and transforms categorical country columns.</w:t>
-      </w:r>
-    </w:p>
-    <w:p>
-      <w:pPr>
-        <w:pStyle w:val="ListBullet"/>
-      </w:pPr>
-      <w:r>
-        <w:t>Loads pickled model files on startup to ensure fast request processing.</w:t>
-      </w:r>
-    </w:p>
-    <w:p>
-      <w:pPr>
-        <w:pStyle w:val="ListBullet"/>
-      </w:pPr>
-      <w:r>
-        <w:t>Clamps predictions to `[0.0, 1.0]` and classifies them into development tiers.</w:t>
-      </w:r>
-    </w:p>
-    <w:p>
-      <w:pPr>
-        <w:pStyle w:val="Heading3"/>
-      </w:pPr>
-      <w:r>
-        <w:t>Activity 3.3: Machine Learning Model Integration</w:t>
-      </w:r>
-    </w:p>
-    <w:p>
-      <w:r>
-        <w:t>The Flask app loads the pickle files on startup:</w:t>
-      </w:r>
-    </w:p>
-    <w:p>
-      <w:pPr>
-        <w:spacing w:before="120" w:after="120"/>
-        <w:ind w:left="360"/>
-        <w:shd w:fill="F1F5F9"/>
-      </w:pPr>
-      <w:r>
-        <w:rPr>
-          <w:rFonts w:ascii="Consolas" w:hAnsi="Consolas"/>
-          <w:color w:val="0F172A"/>
-          <w:sz w:val="19"/>
-        </w:rPr>
-        <w:t>with open("models/hdi_model.pkl", "rb") as f:</w:t>
-        <w:br/>
-        <w:t xml:space="preserve">    model = pickle.load(f)</w:t>
-      </w:r>
-    </w:p>
-    <w:p>
-      <w:r>
-        <w:t>During prediction requests, inputs are processed through the loaded model to generate real-time predictions.</w:t>
-      </w:r>
-    </w:p>
-    <w:p>
-      <w:pPr>
-        <w:pStyle w:val="Heading3"/>
-      </w:pPr>
-      <w:r>
-        <w:t>Activity 3.4: Input Validation</w:t>
-      </w:r>
-    </w:p>
-    <w:p>
-      <w:pPr>
-        <w:pStyle w:val="ListBullet"/>
-      </w:pPr>
-      <w:r/>
-      <w:r>
-        <w:rPr>
-          <w:b/>
-        </w:rPr>
-        <w:t>Client-Side</w:t>
-      </w:r>
-      <w:r>
-        <w:t>: Form inputs enforce minimum and maximum range constraints (e.g. Life Expectancy between 50 and 85).</w:t>
-      </w:r>
-    </w:p>
-    <w:p>
-      <w:pPr>
-        <w:pStyle w:val="ListBullet"/>
-      </w:pPr>
-      <w:r/>
-      <w:r>
-        <w:rPr>
-          <w:b/>
-        </w:rPr>
-        <w:t>Server-Side</w:t>
-      </w:r>
-      <w:r>
-        <w:t>: The Flask backend validates data types and handles exceptions to ensure application stability.</w:t>
-      </w:r>
-    </w:p>
-    <w:p>
-      <w:pPr>
-        <w:pStyle w:val="Heading3"/>
-      </w:pPr>
-      <w:r>
-        <w:t>Activity 3.5: Prediction Result Generation</w:t>
-      </w:r>
-    </w:p>
-    <w:p>
-      <w:r>
-        <w:t>The results page displays:</w:t>
-      </w:r>
-    </w:p>
-    <w:p>
-      <w:pPr>
-        <w:pStyle w:val="ListBullet"/>
-      </w:pPr>
-      <w:r>
-        <w:t>Large numerical predicted score.</w:t>
-      </w:r>
-    </w:p>
-    <w:p>
-      <w:pPr>
-        <w:pStyle w:val="ListBullet"/>
-      </w:pPr>
-      <w:r>
-        <w:t>Dynamic tier badge (🟢 Very High, 🔵 High, 🟠 Medium, 🔴 Low).</w:t>
-      </w:r>
-    </w:p>
-    <w:p>
-      <w:pPr>
-        <w:pStyle w:val="ListBullet"/>
-      </w:pPr>
-      <w:r>
-        <w:t>Visual progress bar mapped to the predicted score.</w:t>
-      </w:r>
-    </w:p>
-    <w:p>
-      <w:pPr>
-        <w:pStyle w:val="ListBullet"/>
-      </w:pPr>
-      <w:r>
-        <w:t>Targeted policy recommendations based on the predicted tier.</w:t>
-      </w:r>
-    </w:p>
-    <w:p>
-      <w:pPr>
-        <w:pStyle w:val="Heading3"/>
-      </w:pPr>
-      <w:r>
-        <w:t>Activity 3.6: Recommendation Module</w:t>
-      </w:r>
-    </w:p>
-    <w:p>
-      <w:r>
-        <w:t>Policy insights are mapped to the predicted tier to provide actionable next steps:</w:t>
-      </w:r>
-    </w:p>
-    <w:p>
-      <w:pPr>
-        <w:pStyle w:val="ListBullet"/>
-      </w:pPr>
-      <w:r/>
-      <w:r>
-        <w:rPr>
-          <w:b/>
-        </w:rPr>
-        <w:t>Very High</w:t>
-      </w:r>
-      <w:r>
-        <w:t>: Focus on higher education quality and inequality reduction.</w:t>
-      </w:r>
-    </w:p>
-    <w:p>
-      <w:pPr>
-        <w:pStyle w:val="ListBullet"/>
-      </w:pPr>
-      <w:r/>
-      <w:r>
-        <w:rPr>
-          <w:b/>
-        </w:rPr>
-        <w:t>High</w:t>
-      </w:r>
-      <w:r>
-        <w:t>: Invest in higher education accessibility and healthcare infrastructure.</w:t>
-      </w:r>
-    </w:p>
-    <w:p>
-      <w:pPr>
-        <w:pStyle w:val="ListBullet"/>
-      </w:pPr>
-      <w:r/>
-      <w:r>
-        <w:rPr>
-          <w:b/>
-        </w:rPr>
-        <w:t>Medium</w:t>
-      </w:r>
-      <w:r>
-        <w:t>: Prioritize school enrollment, sanitation access, and job creation.</w:t>
-      </w:r>
-    </w:p>
-    <w:p>
-      <w:pPr>
-        <w:pStyle w:val="ListBullet"/>
-      </w:pPr>
-      <w:r/>
-      <w:r>
-        <w:rPr>
-          <w:b/>
-        </w:rPr>
-        <w:t>Low</w:t>
-      </w:r>
-      <w:r>
-        <w:t>: Urgently fund basic healthcare, disease prevention, and primary education.</w:t>
-      </w:r>
-    </w:p>
-    <w:p>
-      <w:pPr>
-        <w:pStyle w:val="Heading3"/>
-      </w:pPr>
-      <w:r>
-        <w:t>Activity 3.7: System Integration</w:t>
-      </w:r>
-    </w:p>
-    <w:p>
-      <w:r>
-        <w:t>We integrated the pre-processing scripts, Scikit-learn models, Flask routes, and front-end assets into a complete local software application.</w:t>
-      </w:r>
-    </w:p>
-    <w:p>
-      <w:r>
-        <w:t>---</w:t>
-      </w:r>
-    </w:p>
-    <w:p>
-      <w:pPr>
-        <w:pStyle w:val="Heading2"/>
-      </w:pPr>
-      <w:r>
-        <w:t>Milestone 4: Testing and Performance Evaluation</w:t>
-      </w:r>
-    </w:p>
-    <w:p>
-      <w:pPr>
-        <w:pStyle w:val="Heading3"/>
-      </w:pPr>
-      <w:r>
-        <w:t>Activity 4.1: Functional Testing</w:t>
+        <w:t>6.1 Functional Test Matrix</w:t>
       </w:r>
     </w:p>
     <w:p>
@@ -2195,7 +2503,7 @@
         <w:pStyle w:val="Heading3"/>
       </w:pPr>
       <w:r>
-        <w:t>Activity 4.2: Input Validation Testing</w:t>
+        <w:t>6.2 Input Validation &amp; Boundary Testing</w:t>
       </w:r>
     </w:p>
     <w:p>
@@ -2413,12 +2721,12 @@
         <w:pStyle w:val="Heading3"/>
       </w:pPr>
       <w:r>
-        <w:t>Activity 4.3: Machine Learning Model Evaluation</w:t>
+        <w:t>6.3 Performance and Latency Metrics</w:t>
       </w:r>
     </w:p>
     <w:p>
       <w:r>
-        <w:t>The Linear Regression model was evaluated against other regression algorithms during the design phase:</w:t>
+        <w:t>We measured page load times and prediction latencies using Chrome DevTools.</w:t>
       </w:r>
     </w:p>
     <w:p>
@@ -2430,10 +2738,10 @@
         <w:rPr>
           <w:b/>
         </w:rPr>
-        <w:t>Linear Regression</w:t>
-      </w:r>
-      <w:r>
-        <w:t>: $R^2 = 0.8834$ (highest accuracy, selected for deployment).</w:t>
+        <w:t>Average Prediction Latency</w:t>
+      </w:r>
+      <w:r>
+        <w:t>: Less than 150ms.</w:t>
       </w:r>
     </w:p>
     <w:p>
@@ -2445,10 +2753,10 @@
         <w:rPr>
           <w:b/>
         </w:rPr>
-        <w:t>Decision Tree Regressor</w:t>
-      </w:r>
-      <w:r>
-        <w:t>: $R^2 = 0.8142$.</w:t>
+        <w:t>Home Page Load Time</w:t>
+      </w:r>
+      <w:r>
+        <w:t>: Less than 50ms.</w:t>
       </w:r>
     </w:p>
     <w:p>
@@ -2460,412 +2768,10 @@
         <w:rPr>
           <w:b/>
         </w:rPr>
-        <w:t>K-Neighbors Regressor</w:t>
-      </w:r>
-      <w:r>
-        <w:t>: $R^2 = 0.7811$.</w:t>
-      </w:r>
-    </w:p>
-    <w:p>
-      <w:pPr>
-        <w:pStyle w:val="Heading3"/>
-      </w:pPr>
-      <w:r>
-        <w:t>Activity 4.4: Performance Testing</w:t>
-      </w:r>
-    </w:p>
-    <w:p>
-      <w:r>
-        <w:t>We measured page load times and prediction latencies using Chrome DevTools.</w:t>
-      </w:r>
-    </w:p>
-    <w:tbl>
-      <w:tblPr>
-        <w:tblStyle w:val="TableGrid"/>
-        <w:tblW w:type="auto" w:w="0"/>
-        <w:tblLook w:firstColumn="1" w:firstRow="1" w:lastColumn="0" w:lastRow="0" w:noHBand="0" w:noVBand="1" w:val="04A0"/>
-      </w:tblPr>
-      <w:tblGrid>
-        <w:gridCol w:w="4320"/>
-        <w:gridCol w:w="4320"/>
-      </w:tblGrid>
-      <w:tr>
-        <w:tc>
-          <w:tcPr>
-            <w:tcW w:type="dxa" w:w="4320"/>
-            <w:shd w:fill="2563EB"/>
-          </w:tcPr>
-          <w:p>
-            <w:r>
-              <w:rPr>
-                <w:b/>
-                <w:color w:val="FFFFFF"/>
-              </w:rPr>
-              <w:t>Parameter</w:t>
-            </w:r>
-          </w:p>
-        </w:tc>
-        <w:tc>
-          <w:tcPr>
-            <w:tcW w:type="dxa" w:w="4320"/>
-            <w:shd w:fill="2563EB"/>
-          </w:tcPr>
-          <w:p>
-            <w:r>
-              <w:rPr>
-                <w:b/>
-                <w:color w:val="FFFFFF"/>
-              </w:rPr>
-              <w:t>Measured Result</w:t>
-            </w:r>
-          </w:p>
-        </w:tc>
-      </w:tr>
-      <w:tr>
-        <w:tc>
-          <w:tcPr>
-            <w:tcW w:type="dxa" w:w="4320"/>
-          </w:tcPr>
-          <w:p>
-            <w:r>
-              <w:t>**Average Prediction Latency**</w:t>
-            </w:r>
-          </w:p>
-        </w:tc>
-        <w:tc>
-          <w:tcPr>
-            <w:tcW w:type="dxa" w:w="4320"/>
-          </w:tcPr>
-          <w:p>
-            <w:r>
-              <w:t>Less than 150ms</w:t>
-            </w:r>
-          </w:p>
-        </w:tc>
-      </w:tr>
-      <w:tr>
-        <w:tc>
-          <w:tcPr>
-            <w:tcW w:type="dxa" w:w="4320"/>
-            <w:shd w:fill="F8FAFC"/>
-          </w:tcPr>
-          <w:p>
-            <w:r>
-              <w:t>**Home Page Load Time**</w:t>
-            </w:r>
-          </w:p>
-        </w:tc>
-        <w:tc>
-          <w:tcPr>
-            <w:tcW w:type="dxa" w:w="4320"/>
-            <w:shd w:fill="F8FAFC"/>
-          </w:tcPr>
-          <w:p>
-            <w:r>
-              <w:t>Less than 50ms</w:t>
-            </w:r>
-          </w:p>
-        </w:tc>
-      </w:tr>
-      <w:tr>
-        <w:tc>
-          <w:tcPr>
-            <w:tcW w:type="dxa" w:w="4320"/>
-          </w:tcPr>
-          <w:p>
-            <w:r>
-              <w:t>**Model Loading Time**</w:t>
-            </w:r>
-          </w:p>
-        </w:tc>
-        <w:tc>
-          <w:tcPr>
-            <w:tcW w:type="dxa" w:w="4320"/>
-          </w:tcPr>
-          <w:p>
-            <w:r>
-              <w:t>Less than 10ms</w:t>
-            </w:r>
-          </w:p>
-        </w:tc>
-      </w:tr>
-      <w:tr>
-        <w:tc>
-          <w:tcPr>
-            <w:tcW w:type="dxa" w:w="4320"/>
-            <w:shd w:fill="F8FAFC"/>
-          </w:tcPr>
-          <w:p>
-            <w:r>
-              <w:t>**Consecutive Predictions**</w:t>
-            </w:r>
-          </w:p>
-        </w:tc>
-        <w:tc>
-          <w:tcPr>
-            <w:tcW w:type="dxa" w:w="4320"/>
-            <w:shd w:fill="F8FAFC"/>
-          </w:tcPr>
-          <w:p>
-            <w:r>
-              <w:t>Handled successfully with low latency</w:t>
-            </w:r>
-          </w:p>
-        </w:tc>
-      </w:tr>
-      <w:tr>
-        <w:tc>
-          <w:tcPr>
-            <w:tcW w:type="dxa" w:w="4320"/>
-          </w:tcPr>
-          <w:p>
-            <w:r>
-              <w:t>**Application Stability**</w:t>
-            </w:r>
-          </w:p>
-        </w:tc>
-        <w:tc>
-          <w:tcPr>
-            <w:tcW w:type="dxa" w:w="4320"/>
-          </w:tcPr>
-          <w:p>
-            <w:r>
-              <w:t>Stable with zero memory leaks</w:t>
-            </w:r>
-          </w:p>
-        </w:tc>
-      </w:tr>
-    </w:tbl>
-    <w:p>
-      <w:pPr>
-        <w:pStyle w:val="Heading3"/>
-      </w:pPr>
-      <w:r>
-        <w:t>Activity 4.5: User Acceptance Testing (UAT)</w:t>
-      </w:r>
-    </w:p>
-    <w:p>
-      <w:r>
-        <w:t>We validated the application against target user requirements.</w:t>
-      </w:r>
-    </w:p>
-    <w:tbl>
-      <w:tblPr>
-        <w:tblStyle w:val="TableGrid"/>
-        <w:tblW w:type="auto" w:w="0"/>
-        <w:tblLook w:firstColumn="1" w:firstRow="1" w:lastColumn="0" w:lastRow="0" w:noHBand="0" w:noVBand="1" w:val="04A0"/>
-      </w:tblPr>
-      <w:tblGrid>
-        <w:gridCol w:w="2880"/>
-        <w:gridCol w:w="2880"/>
-        <w:gridCol w:w="2880"/>
-      </w:tblGrid>
-      <w:tr>
-        <w:tc>
-          <w:tcPr>
-            <w:tcW w:type="dxa" w:w="2880"/>
-            <w:shd w:fill="2563EB"/>
-          </w:tcPr>
-          <w:p>
-            <w:r>
-              <w:rPr>
-                <w:b/>
-                <w:color w:val="FFFFFF"/>
-              </w:rPr>
-              <w:t>Requirement</w:t>
-            </w:r>
-          </w:p>
-        </w:tc>
-        <w:tc>
-          <w:tcPr>
-            <w:tcW w:type="dxa" w:w="2880"/>
-            <w:shd w:fill="2563EB"/>
-          </w:tcPr>
-          <w:p>
-            <w:r>
-              <w:rPr>
-                <w:b/>
-                <w:color w:val="FFFFFF"/>
-              </w:rPr>
-              <w:t>Evaluation Result</w:t>
-            </w:r>
-          </w:p>
-        </w:tc>
-        <w:tc>
-          <w:tcPr>
-            <w:tcW w:type="dxa" w:w="2880"/>
-            <w:shd w:fill="2563EB"/>
-          </w:tcPr>
-          <w:p>
-            <w:r>
-              <w:rPr>
-                <w:b/>
-                <w:color w:val="FFFFFF"/>
-              </w:rPr>
-              <w:t>Status</w:t>
-            </w:r>
-          </w:p>
-        </w:tc>
-      </w:tr>
-      <w:tr>
-        <w:tc>
-          <w:tcPr>
-            <w:tcW w:type="dxa" w:w="2880"/>
-          </w:tcPr>
-          <w:p>
-            <w:r>
-              <w:t>**User-Friendly Interface**</w:t>
-            </w:r>
-          </w:p>
-        </w:tc>
-        <w:tc>
-          <w:tcPr>
-            <w:tcW w:type="dxa" w:w="2880"/>
-          </w:tcPr>
-          <w:p>
-            <w:r>
-              <w:t>Simple, intuitive interface with clear navigation</w:t>
-            </w:r>
-          </w:p>
-        </w:tc>
-        <w:tc>
-          <w:tcPr>
-            <w:tcW w:type="dxa" w:w="2880"/>
-          </w:tcPr>
-          <w:p>
-            <w:r>
-              <w:t>✅ Passed</w:t>
-            </w:r>
-          </w:p>
-        </w:tc>
-      </w:tr>
-      <w:tr>
-        <w:tc>
-          <w:tcPr>
-            <w:tcW w:type="dxa" w:w="2880"/>
-            <w:shd w:fill="F8FAFC"/>
-          </w:tcPr>
-          <w:p>
-            <w:r>
-              <w:t>**Accurate Predictions**</w:t>
-            </w:r>
-          </w:p>
-        </w:tc>
-        <w:tc>
-          <w:tcPr>
-            <w:tcW w:type="dxa" w:w="2880"/>
-            <w:shd w:fill="F8FAFC"/>
-          </w:tcPr>
-          <w:p>
-            <w:r>
-              <w:t>Predictions align with historical UNDP development indices</w:t>
-            </w:r>
-          </w:p>
-        </w:tc>
-        <w:tc>
-          <w:tcPr>
-            <w:tcW w:type="dxa" w:w="2880"/>
-            <w:shd w:fill="F8FAFC"/>
-          </w:tcPr>
-          <w:p>
-            <w:r>
-              <w:t>✅ Passed</w:t>
-            </w:r>
-          </w:p>
-        </w:tc>
-      </w:tr>
-      <w:tr>
-        <w:tc>
-          <w:tcPr>
-            <w:tcW w:type="dxa" w:w="2880"/>
-          </w:tcPr>
-          <w:p>
-            <w:r>
-              <w:t>**Input Validation**</w:t>
-            </w:r>
-          </w:p>
-        </w:tc>
-        <w:tc>
-          <w:tcPr>
-            <w:tcW w:type="dxa" w:w="2880"/>
-          </w:tcPr>
-          <w:p>
-            <w:r>
-              <w:t>Range constraints prevent incorrect inputs</w:t>
-            </w:r>
-          </w:p>
-        </w:tc>
-        <w:tc>
-          <w:tcPr>
-            <w:tcW w:type="dxa" w:w="2880"/>
-          </w:tcPr>
-          <w:p>
-            <w:r>
-              <w:t>✅ Passed</w:t>
-            </w:r>
-          </w:p>
-        </w:tc>
-      </w:tr>
-      <w:tr>
-        <w:tc>
-          <w:tcPr>
-            <w:tcW w:type="dxa" w:w="2880"/>
-            <w:shd w:fill="F8FAFC"/>
-          </w:tcPr>
-          <w:p>
-            <w:r>
-              <w:t>**Recommendations Engine**</w:t>
-            </w:r>
-          </w:p>
-        </w:tc>
-        <w:tc>
-          <w:tcPr>
-            <w:tcW w:type="dxa" w:w="2880"/>
-            <w:shd w:fill="F8FAFC"/>
-          </w:tcPr>
-          <w:p>
-            <w:r>
-              <w:t>Generates relevant, tier-specific policy insights</w:t>
-            </w:r>
-          </w:p>
-        </w:tc>
-        <w:tc>
-          <w:tcPr>
-            <w:tcW w:type="dxa" w:w="2880"/>
-            <w:shd w:fill="F8FAFC"/>
-          </w:tcPr>
-          <w:p>
-            <w:r>
-              <w:t>✅ Passed</w:t>
-            </w:r>
-          </w:p>
-        </w:tc>
-      </w:tr>
-    </w:tbl>
-    <w:p>
-      <w:r>
-        <w:t>---</w:t>
-      </w:r>
-    </w:p>
-    <w:p>
-      <w:pPr>
-        <w:pStyle w:val="Heading2"/>
-      </w:pPr>
-      <w:r>
-        <w:t>Milestone 5: Project Demonstration and Conclusion</w:t>
-      </w:r>
-    </w:p>
-    <w:p>
-      <w:pPr>
-        <w:pStyle w:val="Heading3"/>
-      </w:pPr>
-      <w:r>
-        <w:t>Activity 5.1: Application Deployment and Local Execution</w:t>
-      </w:r>
-    </w:p>
-    <w:p>
-      <w:r>
-        <w:t>The application runs locally on a development server.</w:t>
+        <w:t>Model Loading Time</w:t>
+      </w:r>
+      <w:r>
+        <w:t>: Less than 10ms.</w:t>
       </w:r>
     </w:p>
     <w:p>
@@ -2877,10 +2783,10 @@
         <w:rPr>
           <w:b/>
         </w:rPr>
-        <w:t>Activation Command</w:t>
-      </w:r>
-      <w:r>
-        <w:t>: `.\venv\Scripts\Activate`</w:t>
+        <w:t>Consecutive Predictions</w:t>
+      </w:r>
+      <w:r>
+        <w:t>: Handled successfully with low latency.</w:t>
       </w:r>
     </w:p>
     <w:p>
@@ -2892,10 +2798,23 @@
         <w:rPr>
           <w:b/>
         </w:rPr>
-        <w:t>Execution Command</w:t>
-      </w:r>
-      <w:r>
-        <w:t>: `python app.py`</w:t>
+        <w:t>Application Stability</w:t>
+      </w:r>
+      <w:r>
+        <w:t>: Stable with zero memory leaks.</w:t>
+      </w:r>
+    </w:p>
+    <w:p>
+      <w:pPr>
+        <w:pStyle w:val="Heading3"/>
+      </w:pPr>
+      <w:r>
+        <w:t>6.4 User Acceptance Testing (UAT) Scenarios</w:t>
+      </w:r>
+    </w:p>
+    <w:p>
+      <w:r>
+        <w:t>We validated the application against target user requirements:</w:t>
       </w:r>
     </w:p>
     <w:p>
@@ -2907,63 +2826,10 @@
         <w:rPr>
           <w:b/>
         </w:rPr>
-        <w:t>Local URL</w:t>
-      </w:r>
-      <w:r>
-        <w:t>: `http://127.0.0.1:5000`</w:t>
-      </w:r>
-    </w:p>
-    <w:p>
-      <w:pPr>
-        <w:pStyle w:val="Heading3"/>
-      </w:pPr>
-      <w:r>
-        <w:t>Activity 5.2: Demonstration of the Web Application</w:t>
-      </w:r>
-    </w:p>
-    <w:p>
-      <w:r>
-        <w:t>During the presentation, we showcase the end-to-end user flow:</w:t>
-      </w:r>
-    </w:p>
-    <w:p>
-      <w:pPr>
-        <w:pStyle w:val="ListNumber"/>
-      </w:pPr>
-      <w:r>
-        <w:t>Load the home page to explain the three dimensions of HDI.</w:t>
-      </w:r>
-    </w:p>
-    <w:p>
-      <w:pPr>
-        <w:pStyle w:val="ListNumber"/>
-      </w:pPr>
-      <w:r>
-        <w:t>Open the predict form, enter development parameters, and show the real-time prediction output.</w:t>
-      </w:r>
-    </w:p>
-    <w:p>
-      <w:pPr>
-        <w:pStyle w:val="ListNumber"/>
-      </w:pPr>
-      <w:r>
-        <w:t>Highlight the dynamic progress gauge and recommendations list.</w:t>
-      </w:r>
-    </w:p>
-    <w:p>
-      <w:pPr>
-        <w:pStyle w:val="ListNumber"/>
-      </w:pPr>
-      <w:r>
-        <w:t>Navigate to the Model Info tab to explain the model architecture and EDA visualizations.</w:t>
-      </w:r>
-    </w:p>
-    <w:p>
-      <w:pPr>
-        <w:pStyle w:val="Heading3"/>
-      </w:pPr>
-      <w:r>
-        <w:t>Activity 5.3: Exploring the Website</w:t>
+        <w:t>Scenario UAT-1 (Government Analyst)</w:t>
+      </w:r>
+      <w:r>
+        <w:t>: Simulate the impact of a planned educational program on the country's development rating. Entering EYS = 11, MYS = 6.5, Life Exp = 62.5, GNI = $8,500 generates a Medium tier rating and policy recommendations to expand secondary school enrollment.</w:t>
       </w:r>
     </w:p>
     <w:p>
@@ -2975,10 +2841,10 @@
         <w:rPr>
           <w:b/>
         </w:rPr>
-        <w:t>Home Page</w:t>
-      </w:r>
-      <w:r>
-        <w:t>: Introduces the project and explains the Health, Education, and Income dimensions.</w:t>
+        <w:t>Scenario UAT-2 (Academic Researcher)</w:t>
+      </w:r>
+      <w:r>
+        <w:t>: Compare the predicted scores of two country profiles to validate model behavior. The model generates distinct scores for high and low development profiles, confirming that the predictions align with standard HDI trends.</w:t>
       </w:r>
     </w:p>
     <w:p>
@@ -2990,10 +2856,18 @@
         <w:rPr>
           <w:b/>
         </w:rPr>
-        <w:t>Predict Page</w:t>
-      </w:r>
-      <w:r>
-        <w:t>: Provides the slider-like number inputs, range validations, and results card.</w:t>
+        <w:t>Scenario UAT-3 (Economics Student)</w:t>
+      </w:r>
+      <w:r>
+        <w:t>: Learn how each development indicator contributes to the overall HDI score. The interface is intuitive and easy to use without instructions.</w:t>
+      </w:r>
+    </w:p>
+    <w:p>
+      <w:pPr>
+        <w:pStyle w:val="Heading3"/>
+      </w:pPr>
+      <w:r>
+        <w:t>6.5 Issues Identified &amp; Resolved</w:t>
       </w:r>
     </w:p>
     <w:p>
@@ -3005,58 +2879,10 @@
         <w:rPr>
           <w:b/>
         </w:rPr>
-        <w:t>Model Info Page</w:t>
-      </w:r>
-      <w:r>
-        <w:t>: Visualizes feature importances and correlation heatmap plots.</w:t>
-      </w:r>
-    </w:p>
-    <w:p>
-      <w:pPr>
-        <w:pStyle w:val="Heading3"/>
-      </w:pPr>
-      <w:r>
-        <w:t>Activity 5.4: Project Achievements</w:t>
-      </w:r>
-    </w:p>
-    <w:p>
-      <w:pPr>
-        <w:pStyle w:val="ListBullet"/>
-      </w:pPr>
-      <w:r>
-        <w:t>Developed a complete machine learning prediction system for human development rankings.</w:t>
-      </w:r>
-    </w:p>
-    <w:p>
-      <w:pPr>
-        <w:pStyle w:val="ListBullet"/>
-      </w:pPr>
-      <w:r>
-        <w:t>Trained a Linear Regression model achieving an $R^2$ score of 0.8834.</w:t>
-      </w:r>
-    </w:p>
-    <w:p>
-      <w:pPr>
-        <w:pStyle w:val="ListBullet"/>
-      </w:pPr>
-      <w:r>
-        <w:t>Integrated prediction pipelines into an interactive Flask web application.</w:t>
-      </w:r>
-    </w:p>
-    <w:p>
-      <w:pPr>
-        <w:pStyle w:val="ListBullet"/>
-      </w:pPr>
-      <w:r>
-        <w:t>Implemented real-time visualizations and targeted recommendations.</w:t>
-      </w:r>
-    </w:p>
-    <w:p>
-      <w:pPr>
-        <w:pStyle w:val="Heading3"/>
-      </w:pPr>
-      <w:r>
-        <w:t>Activity 5.5: Advantages of the System</w:t>
+        <w:t>Model path resolution error</w:t>
+      </w:r>
+      <w:r>
+        <w:t>: Solved by replacing relative paths with absolute path mappings (`os.path.abspath`) in `app.py`.</w:t>
       </w:r>
     </w:p>
     <w:p>
@@ -3068,10 +2894,10 @@
         <w:rPr>
           <w:b/>
         </w:rPr>
-        <w:t>Real-Time Predictions</w:t>
-      </w:r>
-      <w:r>
-        <w:t>: Calculates scores instantly, bypassing annual reporting delays.</w:t>
+        <w:t>GNI float formatting issue</w:t>
+      </w:r>
+      <w:r>
+        <w:t>: Resolved by replacing the expanded float representation with standard scientific notation (`1.9e-6`) in the mathematical formulation card.</w:t>
       </w:r>
     </w:p>
     <w:p>
@@ -3083,120 +2909,175 @@
         <w:rPr>
           <w:b/>
         </w:rPr>
-        <w:t>Simulations</w:t>
-      </w:r>
-      <w:r>
-        <w:t>: Employs "what-if" planning scenarios for policymakers.</w:t>
+        <w:t>PowerShell permission blocks</w:t>
+      </w:r>
+      <w:r>
+        <w:t>: Documented execution policy modifications to allow virtual environments to activate.</w:t>
       </w:r>
     </w:p>
     <w:p>
-      <w:pPr>
-        <w:pStyle w:val="ListBullet"/>
+      <w:r>
+        <w:t>---</w:t>
+      </w:r>
+    </w:p>
+    <w:p>
+      <w:pPr>
+        <w:pStyle w:val="Heading2"/>
+      </w:pPr>
+      <w:r>
+        <w:t>7. Phase 7 &amp; 8: Project Demonstration, Scalability &amp; Roadmap</w:t>
+      </w:r>
+    </w:p>
+    <w:p>
+      <w:pPr>
+        <w:pStyle w:val="Heading3"/>
+      </w:pPr>
+      <w:r>
+        <w:t>7.1 Demonstration flow and Scenarios</w:t>
+      </w:r>
+    </w:p>
+    <w:p>
+      <w:r>
+        <w:t>The team presents three demonstration scenarios to showcase system capabilities:</w:t>
+      </w:r>
+    </w:p>
+    <w:p>
+      <w:pPr>
+        <w:pStyle w:val="ListNumber"/>
       </w:pPr>
       <w:r/>
       <w:r>
         <w:rPr>
           <w:b/>
         </w:rPr>
-        <w:t>Actionable Insights</w:t>
-      </w:r>
-      <w:r>
-        <w:t>: Replaces raw numbers with clear tier badges and targeted recommendations.</w:t>
+        <w:t>Scenario 1: Very High development simulation</w:t>
+      </w:r>
+      <w:r>
+        <w:t>. Enter parameters for a highly developed country to show the green tier badge, gauge fill, and policy recommendations.</w:t>
       </w:r>
     </w:p>
     <w:p>
       <w:pPr>
-        <w:pStyle w:val="ListBullet"/>
+        <w:pStyle w:val="ListNumber"/>
       </w:pPr>
       <w:r/>
       <w:r>
         <w:rPr>
           <w:b/>
         </w:rPr>
-        <w:t>Aesthetic UI</w:t>
-      </w:r>
-      <w:r>
-        <w:t>: Features a modern, responsive design system.</w:t>
+        <w:t>Scenario 2: Emerging economy simulation</w:t>
+      </w:r>
+      <w:r>
+        <w:t>. Enter parameters for a developing country to show the blue/orange tier badge.</w:t>
       </w:r>
     </w:p>
     <w:p>
       <w:pPr>
-        <w:pStyle w:val="Heading3"/>
-      </w:pPr>
-      <w:r>
-        <w:t>Activity 5.6: Limitations</w:t>
+        <w:pStyle w:val="ListNumber"/>
+      </w:pPr>
+      <w:r/>
+      <w:r>
+        <w:rPr>
+          <w:b/>
+        </w:rPr>
+        <w:t>Scenario 3: Low development simulation</w:t>
+      </w:r>
+      <w:r>
+        <w:t>. Enter parameters for a low-development country to show the red tier badge and urgent intervention recommendations.</w:t>
       </w:r>
     </w:p>
     <w:p>
       <w:pPr>
-        <w:pStyle w:val="ListBullet"/>
-      </w:pPr>
-      <w:r>
-        <w:t>Models are trained on historical datasets and do not reflect real-time global shifts.</w:t>
+        <w:pStyle w:val="Heading3"/>
+      </w:pPr>
+      <w:r>
+        <w:t>7.2 UI Scripted Screen Walkthrough</w:t>
       </w:r>
     </w:p>
     <w:p>
-      <w:pPr>
-        <w:pStyle w:val="ListBullet"/>
-      </w:pPr>
-      <w:r>
-        <w:t>The GNI coefficient is fitted on raw variables rather than log-transformed indexes.</w:t>
+      <w:r>
+        <w:t>We compiled a walkthrough script guide in `8.Project Demonstration/UI_Walkthrough_Script.docx` detailing visual highlights, form parameter inputs, and results display screens for presentation.</w:t>
       </w:r>
     </w:p>
     <w:p>
       <w:pPr>
-        <w:pStyle w:val="ListBullet"/>
-      </w:pPr>
-      <w:r>
-        <w:t>No database storage is implemented for user prediction history.</w:t>
+        <w:pStyle w:val="Heading3"/>
+      </w:pPr>
+      <w:r>
+        <w:t>7.3 Scalability &amp; Future Roadmap</w:t>
       </w:r>
     </w:p>
     <w:p>
       <w:pPr>
-        <w:pStyle w:val="Heading3"/>
-      </w:pPr>
-      <w:r>
-        <w:t>Activity 5.7: Future Enhancements</w:t>
+        <w:pStyle w:val="ListBullet"/>
+      </w:pPr>
+      <w:r/>
+      <w:r>
+        <w:rPr>
+          <w:b/>
+        </w:rPr>
+        <w:t>Model improvements</w:t>
+      </w:r>
+      <w:r>
+        <w:t>: Evaluate alternative algorithms such as Random Forest Regressors or XGBoost.</w:t>
       </w:r>
     </w:p>
     <w:p>
       <w:pPr>
         <w:pStyle w:val="ListBullet"/>
       </w:pPr>
-      <w:r>
-        <w:t>Train the model on official, multi-decade UNDP datasets.</w:t>
+      <w:r/>
+      <w:r>
+        <w:rPr>
+          <w:b/>
+        </w:rPr>
+        <w:t>Data Expansion</w:t>
+      </w:r>
+      <w:r>
+        <w:t>: Train the model on official UN datasets spanning 190+ countries over 30+ years.</w:t>
       </w:r>
     </w:p>
     <w:p>
       <w:pPr>
         <w:pStyle w:val="ListBullet"/>
       </w:pPr>
-      <w:r>
-        <w:t>Implement a dashboard showing historical country development trends.</w:t>
+      <w:r/>
+      <w:r>
+        <w:rPr>
+          <w:b/>
+        </w:rPr>
+        <w:t>REST API Dev</w:t>
+      </w:r>
+      <w:r>
+        <w:t>: Expose prediction endpoints to allow external research systems to run index queries.</w:t>
       </w:r>
     </w:p>
     <w:p>
       <w:pPr>
         <w:pStyle w:val="ListBullet"/>
       </w:pPr>
-      <w:r>
-        <w:t>Build a PDF export feature for policy planners to download simulation reports.</w:t>
+      <w:r/>
+      <w:r>
+        <w:rPr>
+          <w:b/>
+        </w:rPr>
+        <w:t>Cloud Deployment</w:t>
+      </w:r>
+      <w:r>
+        <w:t>: Containerize the server using Docker and deploy to AWS Elastic Beanstalk.</w:t>
       </w:r>
     </w:p>
     <w:p>
-      <w:pPr>
-        <w:pStyle w:val="ListBullet"/>
-      </w:pPr>
-      <w:r>
-        <w:t>Deploy the web application to cloud environments (e.g. Heroku or AWS).</w:t>
+      <w:r>
+        <w:t>---</w:t>
       </w:r>
     </w:p>
     <w:p>
       <w:pPr>
-        <w:pStyle w:val="Heading3"/>
-      </w:pPr>
-      <w:r>
-        <w:t>Conclusion</w:t>
+        <w:pStyle w:val="Heading2"/>
+      </w:pPr>
+      <w:r>
+        <w:t>8. Conclusion &amp; Future Enhancements</w:t>
       </w:r>
     </w:p>
     <w:p>
@@ -3223,7 +3104,7 @@
         <w:pStyle w:val="Heading2"/>
       </w:pPr>
       <w:r>
-        <w:t>Appendix</w:t>
+        <w:t>9. Appendix</w:t>
       </w:r>
     </w:p>
     <w:p>
@@ -3367,60 +3248,7 @@
         <w:pStyle w:val="Heading3"/>
       </w:pPr>
       <w:r>
-        <w:t>Appendix C: Machine Learning Algorithms Used</w:t>
-      </w:r>
-    </w:p>
-    <w:p>
-      <w:pPr>
-        <w:pStyle w:val="ListBullet"/>
-      </w:pPr>
-      <w:r/>
-      <w:r>
-        <w:rPr>
-          <w:b/>
-        </w:rPr>
-        <w:t>Linear Regression</w:t>
-      </w:r>
-      <w:r>
-        <w:t>: Continuous value prediction (selected model).</w:t>
-      </w:r>
-    </w:p>
-    <w:p>
-      <w:pPr>
-        <w:pStyle w:val="ListBullet"/>
-      </w:pPr>
-      <w:r/>
-      <w:r>
-        <w:rPr>
-          <w:b/>
-        </w:rPr>
-        <w:t>Decision Tree Regressor</w:t>
-      </w:r>
-      <w:r>
-        <w:t>: Evaluated during development.</w:t>
-      </w:r>
-    </w:p>
-    <w:p>
-      <w:pPr>
-        <w:pStyle w:val="ListBullet"/>
-      </w:pPr>
-      <w:r/>
-      <w:r>
-        <w:rPr>
-          <w:b/>
-        </w:rPr>
-        <w:t>K-Neighbors Regressor</w:t>
-      </w:r>
-      <w:r>
-        <w:t>: Evaluated during development.</w:t>
-      </w:r>
-    </w:p>
-    <w:p>
-      <w:pPr>
-        <w:pStyle w:val="Heading3"/>
-      </w:pPr>
-      <w:r>
-        <w:t>Appendix D: Project Folder Structure</w:t>
+        <w:t>Appendix C: Project Directory Structure</w:t>
       </w:r>
     </w:p>
     <w:p>
@@ -3439,7 +3267,51 @@
         <w:br/>
         <w:t>│</w:t>
         <w:br/>
+        <w:t>├── 1.Brainstorming &amp; Ideation/</w:t>
+        <w:br/>
+        <w:t>│   ├── Brainstorming &amp; Idea Prioritization.docx</w:t>
+        <w:br/>
+        <w:t>│   ├── Define Problem Statements.docx</w:t>
+        <w:br/>
+        <w:t>│   └── Empathy Map.docx</w:t>
+        <w:br/>
+        <w:t>│</w:t>
+        <w:br/>
+        <w:t>├── 2.Requirement Analysis/</w:t>
+        <w:br/>
+        <w:t>│   ├── Customer Journey Map.docx</w:t>
+        <w:br/>
+        <w:t>│   ├── Data Flow Diagram.docx</w:t>
+        <w:br/>
+        <w:t>│   ├── Solution Requirements.docx</w:t>
+        <w:br/>
+        <w:t>│   └── Technology Stack.docx</w:t>
+        <w:br/>
+        <w:t>│</w:t>
+        <w:br/>
+        <w:t>├── 3.Project Design Phase/</w:t>
+        <w:br/>
+        <w:t>│   ├── Problem - Solution Fit.docx</w:t>
+        <w:br/>
+        <w:t>│   ├── Proposed Solution.docx</w:t>
+        <w:br/>
+        <w:t>│   └── Solution Architecture.docx</w:t>
+        <w:br/>
+        <w:t>│</w:t>
+        <w:br/>
+        <w:t>├── 4.Project Planning Phase/</w:t>
+        <w:br/>
+        <w:t>│   └── Project Planning.docx</w:t>
+        <w:br/>
+        <w:t>│</w:t>
+        <w:br/>
         <w:t>├── 5.Project Development Phase/</w:t>
+        <w:br/>
+        <w:t>│   ├── Code-Layout, Readability and Reusability.docx</w:t>
+        <w:br/>
+        <w:t>│   ├── Coding &amp; Solution.docx</w:t>
+        <w:br/>
+        <w:t>│   ├── No. of Functional Features Included in the Solution.docx</w:t>
         <w:br/>
         <w:t>│   └── code/</w:t>
         <w:br/>
@@ -3480,6 +3352,44 @@
         <w:t>│           ├── indexnew.html</w:t>
         <w:br/>
         <w:t>│           └── model_info.html</w:t>
+        <w:br/>
+        <w:t>│</w:t>
+        <w:br/>
+        <w:t>├── 6.Project Testing/</w:t>
+        <w:br/>
+        <w:t>│   ├── Acceptance Testing.docx</w:t>
+        <w:br/>
+        <w:t>│   ├── Functional &amp; Performance Testing.docx</w:t>
+        <w:br/>
+        <w:t>│   └── Performance Testing.docx</w:t>
+        <w:br/>
+        <w:t>│</w:t>
+        <w:br/>
+        <w:t>├── 7.Project Documentation/</w:t>
+        <w:br/>
+        <w:t>│   ├── Project Documentation.docx</w:t>
+        <w:br/>
+        <w:t>│   └── Project Executable Files.docx</w:t>
+        <w:br/>
+        <w:t>│</w:t>
+        <w:br/>
+        <w:t>└── 8.Project Demonstration/</w:t>
+        <w:br/>
+        <w:t xml:space="preserve">    ├── Communication.docx</w:t>
+        <w:br/>
+        <w:t xml:space="preserve">    ├── Communication_Script.docx</w:t>
+        <w:br/>
+        <w:t xml:space="preserve">    ├── Demonstration of Proposed Features.docx</w:t>
+        <w:br/>
+        <w:t xml:space="preserve">    ├── Project Demo Planning.docx</w:t>
+        <w:br/>
+        <w:t xml:space="preserve">    ├── README.docx</w:t>
+        <w:br/>
+        <w:t xml:space="preserve">    ├── Scalability &amp; Future Plan.docx</w:t>
+        <w:br/>
+        <w:t xml:space="preserve">    ├── Team Involvement in Demonstration.docx</w:t>
+        <w:br/>
+        <w:t xml:space="preserve">    └── UI_Walkthrough_Script.docx</w:t>
       </w:r>
     </w:p>
     <w:p>
@@ -3487,60 +3397,7 @@
         <w:pStyle w:val="Heading3"/>
       </w:pPr>
       <w:r>
-        <w:t>Appendix E: Model Performance</w:t>
-      </w:r>
-    </w:p>
-    <w:p>
-      <w:pPr>
-        <w:pStyle w:val="ListBullet"/>
-      </w:pPr>
-      <w:r/>
-      <w:r>
-        <w:rPr>
-          <w:b/>
-        </w:rPr>
-        <w:t>Linear Regression</w:t>
-      </w:r>
-      <w:r>
-        <w:t>: $R^2 = 0.8834$, $\text{RMSE} = 0.0361$ (highest accuracy).</w:t>
-      </w:r>
-    </w:p>
-    <w:p>
-      <w:pPr>
-        <w:pStyle w:val="ListBullet"/>
-      </w:pPr>
-      <w:r/>
-      <w:r>
-        <w:rPr>
-          <w:b/>
-        </w:rPr>
-        <w:t>Decision Tree</w:t>
-      </w:r>
-      <w:r>
-        <w:t>: $R^2 = 0.8142$, $\text{RMSE} = 0.0452$.</w:t>
-      </w:r>
-    </w:p>
-    <w:p>
-      <w:pPr>
-        <w:pStyle w:val="ListBullet"/>
-      </w:pPr>
-      <w:r/>
-      <w:r>
-        <w:rPr>
-          <w:b/>
-        </w:rPr>
-        <w:t>K-Neighbors</w:t>
-      </w:r>
-      <w:r>
-        <w:t>: $R^2 = 0.7811$, $\text{RMSE} = 0.0491$.</w:t>
-      </w:r>
-    </w:p>
-    <w:p>
-      <w:pPr>
-        <w:pStyle w:val="Heading3"/>
-      </w:pPr>
-      <w:r>
-        <w:t>Appendix F: References</w:t>
+        <w:t>Appendix D: References</w:t>
       </w:r>
     </w:p>
     <w:p>

</xml_diff>